<commit_message>
oumou: structuration du projet backend, frontend et memoire
</commit_message>
<xml_diff>
--- a/Memoire/Memoire-InvoiceAI.docx
+++ b/Memoire/Memoire-InvoiceAI.docx
@@ -14,6 +14,16 @@
           <w:lang w:val="fr-CA"/>
         </w:rPr>
       </w:pPr>
+      <w:r>
+        <w:rPr>
+          <w:b/>
+          <w:bCs/>
+          <w:sz w:val="24"/>
+          <w:szCs w:val="24"/>
+          <w:lang w:val="fr-CA"/>
+        </w:rPr>
+        <w:t>R</w:t>
+      </w:r>
       <w:r>
         <w:rPr>
           <w:b/>
@@ -242,10 +252,13 @@
           <w:szCs w:val="24"/>
           <w:lang w:val="fr-CA"/>
         </w:rPr>
-        <w:t xml:space="preserve">Institut Supérieur d’Enseignement Professionnel Amadou </w:t>
-      </w:r>
-      <w:proofErr w:type="spellStart"/>
-      <w:r>
+        <w:t xml:space="preserve">Institut Supérieur d’Enseignement Professionnel Amadou Trawaré de Diamniadio </w:t>
+      </w:r>
+    </w:p>
+    <w:p>
+      <w:pPr>
+        <w:spacing w:after="60"/>
+        <w:jc w:val="center"/>
         <w:rPr>
           <w:b/>
           <w:bCs/>
@@ -253,10 +266,63 @@
           <w:szCs w:val="24"/>
           <w:lang w:val="fr-CA"/>
         </w:rPr>
-        <w:t>Trawaré</w:t>
-      </w:r>
-      <w:proofErr w:type="spellEnd"/>
-      <w:r>
+      </w:pPr>
+    </w:p>
+    <w:p>
+      <w:pPr>
+        <w:spacing w:after="60"/>
+        <w:ind w:firstLine="720"/>
+        <w:rPr>
+          <w:rStyle w:val="Accentuationlgre"/>
+          <w:lang w:val="fr-CA"/>
+        </w:rPr>
+      </w:pPr>
+      <w:r>
+        <w:rPr>
+          <w:rStyle w:val="Accentuationlgre"/>
+          <w:lang w:val="fr-CA"/>
+        </w:rPr>
+        <w:t>N° :  DISEP_ TIC _P</w:t>
+      </w:r>
+      <w:r>
+        <w:rPr>
+          <w:rStyle w:val="Accentuationlgre"/>
+          <w:lang w:val="fr-CA"/>
+        </w:rPr>
+        <w:t>6</w:t>
+      </w:r>
+      <w:r>
+        <w:rPr>
+          <w:rStyle w:val="Accentuationlgre"/>
+          <w:lang w:val="fr-CA"/>
+        </w:rPr>
+        <w:t xml:space="preserve"> _ Groupe </w:t>
+      </w:r>
+    </w:p>
+    <w:p>
+      <w:pPr>
+        <w:spacing w:after="60"/>
+        <w:ind w:firstLine="720"/>
+        <w:rPr>
+          <w:rStyle w:val="Accentuationlgre"/>
+          <w:lang w:val="fr-CA"/>
+        </w:rPr>
+      </w:pPr>
+    </w:p>
+    <w:p>
+      <w:pPr>
+        <w:spacing w:after="60"/>
+        <w:ind w:firstLine="720"/>
+        <w:rPr>
+          <w:rStyle w:val="Accentuationlgre"/>
+          <w:lang w:val="fr-CA"/>
+        </w:rPr>
+      </w:pPr>
+    </w:p>
+    <w:p>
+      <w:pPr>
+        <w:spacing w:after="60"/>
+        <w:jc w:val="center"/>
         <w:rPr>
           <w:b/>
           <w:bCs/>
@@ -264,13 +330,8 @@
           <w:szCs w:val="24"/>
           <w:lang w:val="fr-CA"/>
         </w:rPr>
-        <w:t xml:space="preserve"> de Diamniadio </w:t>
-      </w:r>
-    </w:p>
-    <w:p>
-      <w:pPr>
-        <w:spacing w:after="60"/>
-        <w:jc w:val="center"/>
+      </w:pPr>
+      <w:r>
         <w:rPr>
           <w:b/>
           <w:bCs/>
@@ -278,63 +339,9 @@
           <w:szCs w:val="24"/>
           <w:lang w:val="fr-CA"/>
         </w:rPr>
-      </w:pPr>
-    </w:p>
-    <w:p>
-      <w:pPr>
-        <w:spacing w:after="60"/>
-        <w:ind w:firstLine="720"/>
-        <w:rPr>
-          <w:rStyle w:val="Accentuationlgre"/>
-          <w:lang w:val="fr-CA"/>
-        </w:rPr>
-      </w:pPr>
-      <w:r>
-        <w:rPr>
-          <w:rStyle w:val="Accentuationlgre"/>
-          <w:lang w:val="fr-CA"/>
-        </w:rPr>
-        <w:t>N° :  DISEP_ TIC _P</w:t>
-      </w:r>
-      <w:r>
-        <w:rPr>
-          <w:rStyle w:val="Accentuationlgre"/>
-          <w:lang w:val="fr-CA"/>
-        </w:rPr>
-        <w:t>6</w:t>
-      </w:r>
-      <w:r>
-        <w:rPr>
-          <w:rStyle w:val="Accentuationlgre"/>
-          <w:lang w:val="fr-CA"/>
-        </w:rPr>
-        <w:t xml:space="preserve"> _ Groupe </w:t>
-      </w:r>
-    </w:p>
-    <w:p>
-      <w:pPr>
-        <w:spacing w:after="60"/>
-        <w:ind w:firstLine="720"/>
-        <w:rPr>
-          <w:rStyle w:val="Accentuationlgre"/>
-          <w:lang w:val="fr-CA"/>
-        </w:rPr>
-      </w:pPr>
-    </w:p>
-    <w:p>
-      <w:pPr>
-        <w:spacing w:after="60"/>
-        <w:ind w:firstLine="720"/>
-        <w:rPr>
-          <w:rStyle w:val="Accentuationlgre"/>
-          <w:lang w:val="fr-CA"/>
-        </w:rPr>
-      </w:pPr>
-    </w:p>
-    <w:p>
-      <w:pPr>
-        <w:spacing w:after="60"/>
-        <w:jc w:val="center"/>
+        <w:t xml:space="preserve"> </w:t>
+      </w:r>
+      <w:r>
         <w:rPr>
           <w:b/>
           <w:bCs/>
@@ -342,8 +349,13 @@
           <w:szCs w:val="24"/>
           <w:lang w:val="fr-CA"/>
         </w:rPr>
-      </w:pPr>
-      <w:r>
+        <w:t>PROJET DE FIN DE FORMATION POUR L’OBTENTION DU DISEP</w:t>
+      </w:r>
+    </w:p>
+    <w:p>
+      <w:pPr>
+        <w:spacing w:after="60"/>
+        <w:jc w:val="center"/>
         <w:rPr>
           <w:b/>
           <w:bCs/>
@@ -351,8 +363,7 @@
           <w:szCs w:val="24"/>
           <w:lang w:val="fr-CA"/>
         </w:rPr>
-        <w:t xml:space="preserve"> </w:t>
-      </w:r>
+      </w:pPr>
       <w:r>
         <w:rPr>
           <w:b/>
@@ -361,13 +372,18 @@
           <w:szCs w:val="24"/>
           <w:lang w:val="fr-CA"/>
         </w:rPr>
-        <w:t>PROJET DE FIN DE FORMATION POUR L’OBTENTION DU DISEP</w:t>
+        <w:t xml:space="preserve"> DIPLOME DES INSTITUTS SUPERIEURS D’ENSEIGNEMENT </w:t>
       </w:r>
     </w:p>
     <w:p>
       <w:pPr>
         <w:spacing w:after="60"/>
         <w:jc w:val="center"/>
+        <w:rPr>
+          <w:lang w:val="fr-CA"/>
+        </w:rPr>
+      </w:pPr>
+      <w:r>
         <w:rPr>
           <w:b/>
           <w:bCs/>
@@ -375,34 +391,6 @@
           <w:szCs w:val="24"/>
           <w:lang w:val="fr-CA"/>
         </w:rPr>
-      </w:pPr>
-      <w:r>
-        <w:rPr>
-          <w:b/>
-          <w:bCs/>
-          <w:sz w:val="24"/>
-          <w:szCs w:val="24"/>
-          <w:lang w:val="fr-CA"/>
-        </w:rPr>
-        <w:t xml:space="preserve"> DIPLOME DES INSTITUTS SUPERIEURS D’ENSEIGNEMENT </w:t>
-      </w:r>
-    </w:p>
-    <w:p>
-      <w:pPr>
-        <w:spacing w:after="60"/>
-        <w:jc w:val="center"/>
-        <w:rPr>
-          <w:lang w:val="fr-CA"/>
-        </w:rPr>
-      </w:pPr>
-      <w:r>
-        <w:rPr>
-          <w:b/>
-          <w:bCs/>
-          <w:sz w:val="24"/>
-          <w:szCs w:val="24"/>
-          <w:lang w:val="fr-CA"/>
-        </w:rPr>
         <w:t>Thème :</w:t>
       </w:r>
     </w:p>
@@ -418,7 +406,6 @@
           <w:lang w:val="fr-CA"/>
         </w:rPr>
       </w:pPr>
-      <w:proofErr w:type="spellStart"/>
       <w:r>
         <w:rPr>
           <w:b/>
@@ -429,7 +416,6 @@
         </w:rPr>
         <w:t>InvoiceAI</w:t>
       </w:r>
-      <w:proofErr w:type="spellEnd"/>
     </w:p>
     <w:p>
       <w:pPr>
@@ -565,13 +551,8 @@
         <w:spacing w:after="400"/>
       </w:pPr>
       <w:r>
-        <w:t xml:space="preserve">Oumou Sow </w:t>
-      </w:r>
-      <w:proofErr w:type="spellStart"/>
-      <w:r>
-        <w:t>Dianor</w:t>
-      </w:r>
-      <w:proofErr w:type="spellEnd"/>
+        <w:t>Oumou Sow Dianor</w:t>
+      </w:r>
       <w:r>
         <w:tab/>
       </w:r>
@@ -590,22 +571,12 @@
       <w:r>
         <w:tab/>
       </w:r>
-      <w:proofErr w:type="spellStart"/>
-      <w:r>
-        <w:t>Mr</w:t>
-      </w:r>
-      <w:proofErr w:type="spellEnd"/>
-      <w:r>
-        <w:t xml:space="preserve"> </w:t>
-      </w:r>
-      <w:r>
-        <w:t xml:space="preserve">Souleymane Harouna </w:t>
-      </w:r>
-      <w:proofErr w:type="spellStart"/>
-      <w:r>
-        <w:t>Maizaboura</w:t>
-      </w:r>
-      <w:proofErr w:type="spellEnd"/>
+      <w:r>
+        <w:t xml:space="preserve">Mr </w:t>
+      </w:r>
+      <w:r>
+        <w:t>Souleymane Harouna Maizaboura</w:t>
+      </w:r>
     </w:p>
     <w:p>
       <w:pPr>
@@ -732,9 +703,8 @@
           <w:szCs w:val="24"/>
           <w:lang w:val="fr-CA"/>
         </w:rPr>
-        <w:t xml:space="preserve">esponsable de filière Développement </w:t>
-      </w:r>
-      <w:proofErr w:type="spellStart"/>
+        <w:t>esponsable de filière Développement Front-En</w:t>
+      </w:r>
       <w:r>
         <w:rPr>
           <w:color w:val="000000"/>
@@ -742,18 +712,8 @@
           <w:szCs w:val="24"/>
           <w:lang w:val="fr-CA"/>
         </w:rPr>
-        <w:t>Front-En</w:t>
-      </w:r>
-      <w:r>
-        <w:rPr>
-          <w:color w:val="000000"/>
-          <w:sz w:val="24"/>
-          <w:szCs w:val="24"/>
-          <w:lang w:val="fr-CA"/>
-        </w:rPr>
         <w:t>d</w:t>
       </w:r>
-      <w:proofErr w:type="spellEnd"/>
     </w:p>
     <w:p>
       <w:pPr>
@@ -898,21 +858,7 @@
         <w:rPr>
           <w:lang w:val="fr-CA"/>
         </w:rPr>
-        <w:t xml:space="preserve">Nous souhaitons dédier ce projet </w:t>
-      </w:r>
-      <w:proofErr w:type="spellStart"/>
-      <w:r>
-        <w:rPr>
-          <w:lang w:val="fr-CA"/>
-        </w:rPr>
-        <w:t>InvoiceAI</w:t>
-      </w:r>
-      <w:proofErr w:type="spellEnd"/>
-      <w:r>
-        <w:rPr>
-          <w:lang w:val="fr-CA"/>
-        </w:rPr>
-        <w:t xml:space="preserve"> à toutes les personnes qui ont contribué, de près ou de loin, à sa réussite.</w:t>
+        <w:t>Nous souhaitons dédier ce projet InvoiceAI à toutes les personnes qui ont contribué, de près ou de loin, à sa réussite.</w:t>
       </w:r>
     </w:p>
     <w:p>
@@ -942,21 +888,7 @@
         <w:rPr>
           <w:lang w:val="fr-CA"/>
         </w:rPr>
-        <w:t>Nous adressons également nos sincères remerciements à nos formateurs et encadreurs pour leurs précieux conseils, leur disponibilité et leur accompagnement tout au long de la réalisation de ce projet. Leur exigence, leur bienveillance et leur sens du partage ont contribué à faire d'</w:t>
-      </w:r>
-      <w:proofErr w:type="spellStart"/>
-      <w:r>
-        <w:rPr>
-          <w:lang w:val="fr-CA"/>
-        </w:rPr>
-        <w:t>InvoiceAI</w:t>
-      </w:r>
-      <w:proofErr w:type="spellEnd"/>
-      <w:r>
-        <w:rPr>
-          <w:lang w:val="fr-CA"/>
-        </w:rPr>
-        <w:t xml:space="preserve"> un projet abouti et enrichissant.</w:t>
+        <w:t>Nous adressons également nos sincères remerciements à nos formateurs et encadreurs pour leurs précieux conseils, leur disponibilité et leur accompagnement tout au long de la réalisation de ce projet. Leur exigence, leur bienveillance et leur sens du partage ont contribué à faire d'InvoiceAI un projet abouti et enrichissant.</w:t>
       </w:r>
     </w:p>
     <w:p>
@@ -986,21 +918,7 @@
         <w:rPr>
           <w:lang w:val="fr-CA"/>
         </w:rPr>
-        <w:t xml:space="preserve">Enfin, nous exprimons notre reconnaissance envers toutes les personnes — amis, collègues ou proches — qui nous ont soutenues, encouragées et motivées durant cette aventure académique. Un grand merci à vous toutes et tous pour avoir rendu le projet </w:t>
-      </w:r>
-      <w:proofErr w:type="spellStart"/>
-      <w:r>
-        <w:rPr>
-          <w:lang w:val="fr-CA"/>
-        </w:rPr>
-        <w:t>InvoiceAI</w:t>
-      </w:r>
-      <w:proofErr w:type="spellEnd"/>
-      <w:r>
-        <w:rPr>
-          <w:lang w:val="fr-CA"/>
-        </w:rPr>
-        <w:t xml:space="preserve"> possible !</w:t>
+        <w:t>Enfin, nous exprimons notre reconnaissance envers toutes les personnes — amis, collègues ou proches — qui nous ont soutenues, encouragées et motivées durant cette aventure académique. Un grand merci à vous toutes et tous pour avoir rendu le projet InvoiceAI possible !</w:t>
       </w:r>
     </w:p>
     <w:p>
@@ -1051,21 +969,7 @@
         <w:rPr>
           <w:lang w:val="fr-CA"/>
         </w:rPr>
-        <w:t xml:space="preserve">Nous souhaitons exprimer notre profonde gratitude envers l'Institut Supérieur d'Enseignement Professionnel de Diamniadio (ISEP Diamniadio) pour son accompagnement, sa confiance et son soutien indéfectible tout au long de la réalisation de ce projet de fin de formation. L'expertise, la rigueur et la qualité de la formation dispensée au sein de l'institut ont été des atouts majeurs dans la réussite de notre projet </w:t>
-      </w:r>
-      <w:proofErr w:type="spellStart"/>
-      <w:r>
-        <w:rPr>
-          <w:lang w:val="fr-CA"/>
-        </w:rPr>
-        <w:t>InvoiceAI</w:t>
-      </w:r>
-      <w:proofErr w:type="spellEnd"/>
-      <w:r>
-        <w:rPr>
-          <w:lang w:val="fr-CA"/>
-        </w:rPr>
-        <w:t>.</w:t>
+        <w:t>Nous souhaitons exprimer notre profonde gratitude envers l'Institut Supérieur d'Enseignement Professionnel de Diamniadio (ISEP Diamniadio) pour son accompagnement, sa confiance et son soutien indéfectible tout au long de la réalisation de ce projet de fin de formation. L'expertise, la rigueur et la qualité de la formation dispensée au sein de l'institut ont été des atouts majeurs dans la réussite de notre projet InvoiceAI.</w:t>
       </w:r>
     </w:p>
     <w:p>
@@ -1101,27 +1005,13 @@
         <w:rPr>
           <w:lang w:val="fr-CA"/>
         </w:rPr>
-        <w:t>Docteur</w:t>
-      </w:r>
-      <w:r>
-        <w:rPr>
-          <w:lang w:val="fr-CA"/>
-        </w:rPr>
-        <w:t xml:space="preserve"> Cheikh Ahmed Tidiane Cherif Ndiaye, Responsable de la filière Développement </w:t>
-      </w:r>
-      <w:proofErr w:type="spellStart"/>
-      <w:r>
-        <w:rPr>
-          <w:lang w:val="fr-CA"/>
-        </w:rPr>
-        <w:t>Front-End</w:t>
-      </w:r>
-      <w:proofErr w:type="spellEnd"/>
-      <w:r>
-        <w:rPr>
-          <w:lang w:val="fr-CA"/>
-        </w:rPr>
-        <w:t>, pour la qualité de son encadrement, ses orientations techniques et son implication constante dans notre parcours. Son engagement, ses encouragements et son souci de nous transmettre le meilleur de son savoir-faire ont marqué positivement notre expérience académique et professionnelle.</w:t>
+        <w:t>Dr</w:t>
+      </w:r>
+      <w:r>
+        <w:rPr>
+          <w:lang w:val="fr-CA"/>
+        </w:rPr>
+        <w:t xml:space="preserve"> Cheikh Ahmed Tidiane Cherif Ndiaye, Responsable de la filière Développement Front-End, pour la qualité de son encadrement, ses orientations techniques et son implication constante dans notre parcours. Son engagement, ses encouragements et son souci de nous transmettre le meilleur de son savoir-faire ont marqué positivement notre expérience académique et professionnelle.</w:t>
       </w:r>
     </w:p>
     <w:p>
@@ -1136,35 +1026,7 @@
         <w:rPr>
           <w:lang w:val="fr-CA"/>
         </w:rPr>
-        <w:t xml:space="preserve">Nous remercions aussi l'ensemble du corps enseignant de l'ISEP Diamniadio, en particulier les responsables des filières Développement </w:t>
-      </w:r>
-      <w:proofErr w:type="spellStart"/>
-      <w:r>
-        <w:rPr>
-          <w:lang w:val="fr-CA"/>
-        </w:rPr>
-        <w:t>Front-end</w:t>
-      </w:r>
-      <w:proofErr w:type="spellEnd"/>
-      <w:r>
-        <w:rPr>
-          <w:lang w:val="fr-CA"/>
-        </w:rPr>
-        <w:t xml:space="preserve"> et </w:t>
-      </w:r>
-      <w:proofErr w:type="spellStart"/>
-      <w:r>
-        <w:rPr>
-          <w:lang w:val="fr-CA"/>
-        </w:rPr>
-        <w:t>Back-end</w:t>
-      </w:r>
-      <w:proofErr w:type="spellEnd"/>
-      <w:r>
-        <w:rPr>
-          <w:lang w:val="fr-CA"/>
-        </w:rPr>
-        <w:t>, pour la qualité de leurs enseignements et leur implication dans notre parcours.</w:t>
+        <w:t>Nous remercions aussi l'ensemble du corps enseignant de l'ISEP Diamniadio, en particulier les responsables des filières Développement Front-end et Back-end, pour la qualité de leurs enseignements et leur implication dans notre parcours.</w:t>
       </w:r>
     </w:p>
     <w:p>
@@ -1264,26 +1126,40 @@
           <w:b/>
           <w:bCs/>
         </w:rPr>
-        <w:t xml:space="preserve">➢ </w:t>
-      </w:r>
-      <w:proofErr w:type="gramStart"/>
+        <w:t xml:space="preserve">➢ UML : </w:t>
+      </w:r>
+      <w:r>
+        <w:t>Unified Modeling Language</w:t>
+      </w:r>
+    </w:p>
+    <w:p>
+      <w:pPr>
+        <w:spacing w:after="100"/>
+      </w:pPr>
       <w:r>
         <w:rPr>
           <w:b/>
           <w:bCs/>
         </w:rPr>
-        <w:t>UML :</w:t>
-      </w:r>
-      <w:proofErr w:type="gramEnd"/>
+        <w:t xml:space="preserve">➢ HTML : </w:t>
+      </w:r>
+      <w:r>
+        <w:t>HyperText Markup Language</w:t>
+      </w:r>
+    </w:p>
+    <w:p>
+      <w:pPr>
+        <w:spacing w:after="100"/>
+      </w:pPr>
       <w:r>
         <w:rPr>
           <w:b/>
           <w:bCs/>
         </w:rPr>
-        <w:t xml:space="preserve"> </w:t>
-      </w:r>
-      <w:r>
-        <w:t>Unified Modeling Language</w:t>
+        <w:t xml:space="preserve">➢ CSS : </w:t>
+      </w:r>
+      <w:r>
+        <w:t>Cascading Style Sheets</w:t>
       </w:r>
     </w:p>
     <w:p>
@@ -1295,31 +1171,54 @@
           <w:b/>
           <w:bCs/>
         </w:rPr>
-        <w:t xml:space="preserve">➢ </w:t>
-      </w:r>
-      <w:proofErr w:type="gramStart"/>
+        <w:t xml:space="preserve">➢ MySQL : </w:t>
+      </w:r>
+      <w:r>
+        <w:t>My Structured Query Language</w:t>
+      </w:r>
+    </w:p>
+    <w:p>
+      <w:pPr>
+        <w:spacing w:after="100"/>
+        <w:rPr>
+          <w:lang w:val="fr-CA"/>
+        </w:rPr>
+      </w:pPr>
       <w:r>
         <w:rPr>
           <w:b/>
           <w:bCs/>
-        </w:rPr>
-        <w:t>HTML :</w:t>
-      </w:r>
-      <w:proofErr w:type="gramEnd"/>
+          <w:lang w:val="fr-CA"/>
+        </w:rPr>
+        <w:t xml:space="preserve">➢ PHP : </w:t>
+      </w:r>
+      <w:r>
+        <w:rPr>
+          <w:lang w:val="fr-CA"/>
+        </w:rPr>
+        <w:t>PHP Hypertext Preprocessor</w:t>
+      </w:r>
+    </w:p>
+    <w:p>
+      <w:pPr>
+        <w:spacing w:after="100"/>
+        <w:rPr>
+          <w:lang w:val="fr-CA"/>
+        </w:rPr>
+      </w:pPr>
       <w:r>
         <w:rPr>
           <w:b/>
           <w:bCs/>
-        </w:rPr>
-        <w:t xml:space="preserve"> </w:t>
-      </w:r>
-      <w:proofErr w:type="spellStart"/>
-      <w:r>
-        <w:t>HyperText</w:t>
-      </w:r>
-      <w:proofErr w:type="spellEnd"/>
-      <w:r>
-        <w:t xml:space="preserve"> Markup Language</w:t>
+          <w:lang w:val="fr-CA"/>
+        </w:rPr>
+        <w:t xml:space="preserve">➢ MVC : </w:t>
+      </w:r>
+      <w:r>
+        <w:rPr>
+          <w:lang w:val="fr-CA"/>
+        </w:rPr>
+        <w:t>Modèle-Vue-Contrôleur</w:t>
       </w:r>
     </w:p>
     <w:p>
@@ -1331,57 +1230,113 @@
           <w:b/>
           <w:bCs/>
         </w:rPr>
-        <w:t xml:space="preserve">➢ </w:t>
-      </w:r>
-      <w:proofErr w:type="gramStart"/>
+        <w:t xml:space="preserve">➢ API : </w:t>
+      </w:r>
+      <w:r>
+        <w:t>Application Programming Interface</w:t>
+      </w:r>
+    </w:p>
+    <w:p>
+      <w:pPr>
+        <w:spacing w:after="100"/>
+      </w:pPr>
       <w:r>
         <w:rPr>
           <w:b/>
           <w:bCs/>
         </w:rPr>
-        <w:t>CSS :</w:t>
-      </w:r>
-      <w:proofErr w:type="gramEnd"/>
+        <w:t xml:space="preserve">➢ REST : </w:t>
+      </w:r>
+      <w:r>
+        <w:t>Representational State Transfer</w:t>
+      </w:r>
+    </w:p>
+    <w:p>
+      <w:pPr>
+        <w:spacing w:after="100"/>
+        <w:rPr>
+          <w:lang w:val="fr-CA"/>
+        </w:rPr>
+      </w:pPr>
       <w:r>
         <w:rPr>
           <w:b/>
           <w:bCs/>
-        </w:rPr>
-        <w:t xml:space="preserve"> </w:t>
-      </w:r>
-      <w:r>
-        <w:t>Cascading Style Sheets</w:t>
+          <w:lang w:val="fr-CA"/>
+        </w:rPr>
+        <w:t xml:space="preserve">➢ IA : </w:t>
+      </w:r>
+      <w:r>
+        <w:rPr>
+          <w:lang w:val="fr-CA"/>
+        </w:rPr>
+        <w:t>Intelligence Artificielle</w:t>
       </w:r>
     </w:p>
     <w:p>
       <w:pPr>
         <w:spacing w:after="100"/>
+        <w:rPr>
+          <w:lang w:val="fr-CA"/>
+        </w:rPr>
       </w:pPr>
       <w:r>
         <w:rPr>
           <w:b/>
           <w:bCs/>
-        </w:rPr>
-        <w:t xml:space="preserve">➢ </w:t>
-      </w:r>
-      <w:proofErr w:type="gramStart"/>
+          <w:lang w:val="fr-CA"/>
+        </w:rPr>
+        <w:t xml:space="preserve">➢ PDF : </w:t>
+      </w:r>
+      <w:r>
+        <w:rPr>
+          <w:lang w:val="fr-CA"/>
+        </w:rPr>
+        <w:t>Portable Document Format</w:t>
+      </w:r>
+    </w:p>
+    <w:p>
+      <w:pPr>
+        <w:spacing w:after="100"/>
+        <w:rPr>
+          <w:lang w:val="fr-CA"/>
+        </w:rPr>
+      </w:pPr>
       <w:r>
         <w:rPr>
           <w:b/>
           <w:bCs/>
-        </w:rPr>
-        <w:t>MySQL :</w:t>
-      </w:r>
-      <w:proofErr w:type="gramEnd"/>
+          <w:lang w:val="fr-CA"/>
+        </w:rPr>
+        <w:t xml:space="preserve">➢ SaaS : </w:t>
+      </w:r>
+      <w:r>
+        <w:rPr>
+          <w:lang w:val="fr-CA"/>
+        </w:rPr>
+        <w:t>Software as a Service</w:t>
+      </w:r>
+    </w:p>
+    <w:p>
+      <w:pPr>
+        <w:spacing w:after="100"/>
+        <w:rPr>
+          <w:lang w:val="fr-CA"/>
+        </w:rPr>
+      </w:pPr>
       <w:r>
         <w:rPr>
           <w:b/>
           <w:bCs/>
-        </w:rPr>
-        <w:t xml:space="preserve"> </w:t>
-      </w:r>
-      <w:r>
-        <w:t>My Structured Query Language</w:t>
+          <w:lang w:val="fr-CA"/>
+        </w:rPr>
+        <w:t xml:space="preserve">➢ TPE : </w:t>
+      </w:r>
+      <w:r>
+        <w:rPr>
+          <w:lang w:val="fr-CA"/>
+        </w:rPr>
+        <w:t>Très Petite Entreprise</w:t>
       </w:r>
     </w:p>
     <w:p>
@@ -1397,36 +1352,14 @@
           <w:bCs/>
           <w:lang w:val="fr-CA"/>
         </w:rPr>
-        <w:t xml:space="preserve">➢ PHP : </w:t>
-      </w:r>
-      <w:r>
-        <w:rPr>
-          <w:lang w:val="fr-CA"/>
-        </w:rPr>
-        <w:t xml:space="preserve">PHP </w:t>
-      </w:r>
-      <w:proofErr w:type="spellStart"/>
-      <w:r>
-        <w:rPr>
-          <w:lang w:val="fr-CA"/>
-        </w:rPr>
-        <w:t>Hypertext</w:t>
-      </w:r>
-      <w:proofErr w:type="spellEnd"/>
-      <w:r>
-        <w:rPr>
-          <w:lang w:val="fr-CA"/>
-        </w:rPr>
-        <w:t xml:space="preserve"> </w:t>
-      </w:r>
-      <w:proofErr w:type="spellStart"/>
-      <w:r>
-        <w:rPr>
-          <w:lang w:val="fr-CA"/>
-        </w:rPr>
-        <w:t>Preprocessor</w:t>
-      </w:r>
-      <w:proofErr w:type="spellEnd"/>
+        <w:t xml:space="preserve">➢ PME : </w:t>
+      </w:r>
+      <w:r>
+        <w:rPr>
+          <w:lang w:val="fr-CA"/>
+        </w:rPr>
+        <w:t>Petite et Moyenne Entreprise</w:t>
+      </w:r>
     </w:p>
     <w:p>
       <w:pPr>
@@ -1441,13 +1374,13 @@
           <w:bCs/>
           <w:lang w:val="fr-CA"/>
         </w:rPr>
-        <w:t xml:space="preserve">➢ MVC : </w:t>
-      </w:r>
-      <w:r>
-        <w:rPr>
-          <w:lang w:val="fr-CA"/>
-        </w:rPr>
-        <w:t>Modèle-Vue-Contrôleur</w:t>
+        <w:t xml:space="preserve">➢ JSON : </w:t>
+      </w:r>
+      <w:r>
+        <w:rPr>
+          <w:lang w:val="fr-CA"/>
+        </w:rPr>
+        <w:t>JavaScript Object Notation</w:t>
       </w:r>
     </w:p>
     <w:p>
@@ -1459,344 +1392,82 @@
           <w:b/>
           <w:bCs/>
         </w:rPr>
-        <w:t xml:space="preserve">➢ </w:t>
-      </w:r>
-      <w:proofErr w:type="gramStart"/>
+        <w:t xml:space="preserve">➢ SMTP : </w:t>
+      </w:r>
+      <w:r>
+        <w:t>Simple Mail Transfer Protocol</w:t>
+      </w:r>
+    </w:p>
+    <w:p>
+      <w:pPr>
+        <w:spacing w:after="100"/>
+      </w:pPr>
       <w:r>
         <w:rPr>
           <w:b/>
           <w:bCs/>
         </w:rPr>
-        <w:t>API :</w:t>
-      </w:r>
-      <w:proofErr w:type="gramEnd"/>
+        <w:t xml:space="preserve">➢ CRUD : </w:t>
+      </w:r>
+      <w:r>
+        <w:t>Create, Read, Update, Delete</w:t>
+      </w:r>
+    </w:p>
+    <w:p>
+      <w:pPr>
+        <w:spacing w:after="100"/>
+        <w:rPr>
+          <w:lang w:val="fr-CA"/>
+        </w:rPr>
+      </w:pPr>
       <w:r>
         <w:rPr>
           <w:b/>
           <w:bCs/>
-        </w:rPr>
-        <w:t xml:space="preserve"> </w:t>
-      </w:r>
-      <w:r>
-        <w:t>Application Programming Interface</w:t>
+          <w:lang w:val="fr-CA"/>
+        </w:rPr>
+        <w:t xml:space="preserve">➢ IDE : </w:t>
+      </w:r>
+      <w:r>
+        <w:rPr>
+          <w:lang w:val="fr-CA"/>
+        </w:rPr>
+        <w:t>Integrated Development Environment</w:t>
       </w:r>
     </w:p>
     <w:p>
       <w:pPr>
         <w:spacing w:after="100"/>
+        <w:rPr>
+          <w:lang w:val="fr-CA"/>
+        </w:rPr>
       </w:pPr>
       <w:r>
         <w:rPr>
           <w:b/>
           <w:bCs/>
-        </w:rPr>
-        <w:t xml:space="preserve">➢ </w:t>
-      </w:r>
-      <w:proofErr w:type="gramStart"/>
+          <w:lang w:val="fr-CA"/>
+        </w:rPr>
+        <w:t xml:space="preserve">➢ TVA : </w:t>
+      </w:r>
+      <w:r>
+        <w:rPr>
+          <w:lang w:val="fr-CA"/>
+        </w:rPr>
+        <w:t>Taxe sur la Valeur Ajoutée</w:t>
+      </w:r>
+    </w:p>
+    <w:p>
+      <w:pPr>
+        <w:spacing w:after="100"/>
+        <w:rPr>
+          <w:lang w:val="fr-CA"/>
+        </w:rPr>
+      </w:pPr>
       <w:r>
         <w:rPr>
           <w:b/>
           <w:bCs/>
-        </w:rPr>
-        <w:t>REST :</w:t>
-      </w:r>
-      <w:proofErr w:type="gramEnd"/>
-      <w:r>
-        <w:rPr>
-          <w:b/>
-          <w:bCs/>
-        </w:rPr>
-        <w:t xml:space="preserve"> </w:t>
-      </w:r>
-      <w:r>
-        <w:t>Representational State Transfer</w:t>
-      </w:r>
-    </w:p>
-    <w:p>
-      <w:pPr>
-        <w:spacing w:after="100"/>
-        <w:rPr>
-          <w:lang w:val="fr-CA"/>
-        </w:rPr>
-      </w:pPr>
-      <w:r>
-        <w:rPr>
-          <w:b/>
-          <w:bCs/>
-          <w:lang w:val="fr-CA"/>
-        </w:rPr>
-        <w:t xml:space="preserve">➢ IA : </w:t>
-      </w:r>
-      <w:r>
-        <w:rPr>
-          <w:lang w:val="fr-CA"/>
-        </w:rPr>
-        <w:t>Intelligence Artificielle</w:t>
-      </w:r>
-    </w:p>
-    <w:p>
-      <w:pPr>
-        <w:spacing w:after="100"/>
-        <w:rPr>
-          <w:lang w:val="fr-CA"/>
-        </w:rPr>
-      </w:pPr>
-      <w:r>
-        <w:rPr>
-          <w:b/>
-          <w:bCs/>
-          <w:lang w:val="fr-CA"/>
-        </w:rPr>
-        <w:t xml:space="preserve">➢ PDF : </w:t>
-      </w:r>
-      <w:r>
-        <w:rPr>
-          <w:lang w:val="fr-CA"/>
-        </w:rPr>
-        <w:t>Portable Document Format</w:t>
-      </w:r>
-    </w:p>
-    <w:p>
-      <w:pPr>
-        <w:spacing w:after="100"/>
-        <w:rPr>
-          <w:lang w:val="fr-CA"/>
-        </w:rPr>
-      </w:pPr>
-      <w:r>
-        <w:rPr>
-          <w:b/>
-          <w:bCs/>
-          <w:lang w:val="fr-CA"/>
-        </w:rPr>
-        <w:t xml:space="preserve">➢ SaaS : </w:t>
-      </w:r>
-      <w:r>
-        <w:rPr>
-          <w:lang w:val="fr-CA"/>
-        </w:rPr>
-        <w:t xml:space="preserve">Software as </w:t>
-      </w:r>
-      <w:proofErr w:type="gramStart"/>
-      <w:r>
-        <w:rPr>
-          <w:lang w:val="fr-CA"/>
-        </w:rPr>
-        <w:t>a</w:t>
-      </w:r>
-      <w:proofErr w:type="gramEnd"/>
-      <w:r>
-        <w:rPr>
-          <w:lang w:val="fr-CA"/>
-        </w:rPr>
-        <w:t xml:space="preserve"> Service</w:t>
-      </w:r>
-    </w:p>
-    <w:p>
-      <w:pPr>
-        <w:spacing w:after="100"/>
-        <w:rPr>
-          <w:lang w:val="fr-CA"/>
-        </w:rPr>
-      </w:pPr>
-      <w:r>
-        <w:rPr>
-          <w:b/>
-          <w:bCs/>
-          <w:lang w:val="fr-CA"/>
-        </w:rPr>
-        <w:t xml:space="preserve">➢ TPE : </w:t>
-      </w:r>
-      <w:r>
-        <w:rPr>
-          <w:lang w:val="fr-CA"/>
-        </w:rPr>
-        <w:t>Très Petite Entreprise</w:t>
-      </w:r>
-    </w:p>
-    <w:p>
-      <w:pPr>
-        <w:spacing w:after="100"/>
-        <w:rPr>
-          <w:lang w:val="fr-CA"/>
-        </w:rPr>
-      </w:pPr>
-      <w:r>
-        <w:rPr>
-          <w:b/>
-          <w:bCs/>
-          <w:lang w:val="fr-CA"/>
-        </w:rPr>
-        <w:t xml:space="preserve">➢ PME : </w:t>
-      </w:r>
-      <w:r>
-        <w:rPr>
-          <w:lang w:val="fr-CA"/>
-        </w:rPr>
-        <w:t>Petite et Moyenne Entreprise</w:t>
-      </w:r>
-    </w:p>
-    <w:p>
-      <w:pPr>
-        <w:spacing w:after="100"/>
-        <w:rPr>
-          <w:lang w:val="fr-CA"/>
-        </w:rPr>
-      </w:pPr>
-      <w:r>
-        <w:rPr>
-          <w:b/>
-          <w:bCs/>
-          <w:lang w:val="fr-CA"/>
-        </w:rPr>
-        <w:t xml:space="preserve">➢ JSON : </w:t>
-      </w:r>
-      <w:r>
-        <w:rPr>
-          <w:lang w:val="fr-CA"/>
-        </w:rPr>
-        <w:t>JavaScript Object Notation</w:t>
-      </w:r>
-    </w:p>
-    <w:p>
-      <w:pPr>
-        <w:spacing w:after="100"/>
-      </w:pPr>
-      <w:r>
-        <w:rPr>
-          <w:b/>
-          <w:bCs/>
-        </w:rPr>
-        <w:t xml:space="preserve">➢ </w:t>
-      </w:r>
-      <w:proofErr w:type="gramStart"/>
-      <w:r>
-        <w:rPr>
-          <w:b/>
-          <w:bCs/>
-        </w:rPr>
-        <w:t>SMTP :</w:t>
-      </w:r>
-      <w:proofErr w:type="gramEnd"/>
-      <w:r>
-        <w:rPr>
-          <w:b/>
-          <w:bCs/>
-        </w:rPr>
-        <w:t xml:space="preserve"> </w:t>
-      </w:r>
-      <w:r>
-        <w:t>Simple Mail Transfer Protocol</w:t>
-      </w:r>
-    </w:p>
-    <w:p>
-      <w:pPr>
-        <w:spacing w:after="100"/>
-      </w:pPr>
-      <w:r>
-        <w:rPr>
-          <w:b/>
-          <w:bCs/>
-        </w:rPr>
-        <w:t xml:space="preserve">➢ </w:t>
-      </w:r>
-      <w:proofErr w:type="gramStart"/>
-      <w:r>
-        <w:rPr>
-          <w:b/>
-          <w:bCs/>
-        </w:rPr>
-        <w:t>CRUD :</w:t>
-      </w:r>
-      <w:proofErr w:type="gramEnd"/>
-      <w:r>
-        <w:rPr>
-          <w:b/>
-          <w:bCs/>
-        </w:rPr>
-        <w:t xml:space="preserve"> </w:t>
-      </w:r>
-      <w:r>
-        <w:t>Create, Read, Update, Delete</w:t>
-      </w:r>
-    </w:p>
-    <w:p>
-      <w:pPr>
-        <w:spacing w:after="100"/>
-        <w:rPr>
-          <w:lang w:val="fr-CA"/>
-        </w:rPr>
-      </w:pPr>
-      <w:r>
-        <w:rPr>
-          <w:b/>
-          <w:bCs/>
-          <w:lang w:val="fr-CA"/>
-        </w:rPr>
-        <w:t xml:space="preserve">➢ IDE : </w:t>
-      </w:r>
-      <w:r>
-        <w:rPr>
-          <w:lang w:val="fr-CA"/>
-        </w:rPr>
-        <w:t xml:space="preserve">Integrated </w:t>
-      </w:r>
-      <w:proofErr w:type="spellStart"/>
-      <w:r>
-        <w:rPr>
-          <w:lang w:val="fr-CA"/>
-        </w:rPr>
-        <w:t>Development</w:t>
-      </w:r>
-      <w:proofErr w:type="spellEnd"/>
-      <w:r>
-        <w:rPr>
-          <w:lang w:val="fr-CA"/>
-        </w:rPr>
-        <w:t xml:space="preserve"> </w:t>
-      </w:r>
-      <w:proofErr w:type="spellStart"/>
-      <w:r>
-        <w:rPr>
-          <w:lang w:val="fr-CA"/>
-        </w:rPr>
-        <w:t>Environment</w:t>
-      </w:r>
-      <w:proofErr w:type="spellEnd"/>
-    </w:p>
-    <w:p>
-      <w:pPr>
-        <w:spacing w:after="100"/>
-        <w:rPr>
-          <w:lang w:val="fr-CA"/>
-        </w:rPr>
-      </w:pPr>
-      <w:r>
-        <w:rPr>
-          <w:b/>
-          <w:bCs/>
-          <w:lang w:val="fr-CA"/>
-        </w:rPr>
-        <w:t xml:space="preserve">➢ TVA : </w:t>
-      </w:r>
-      <w:r>
-        <w:rPr>
-          <w:lang w:val="fr-CA"/>
-        </w:rPr>
-        <w:t>Taxe sur la Valeur Ajoutée</w:t>
-      </w:r>
-    </w:p>
-    <w:p>
-      <w:pPr>
-        <w:spacing w:after="100"/>
-        <w:rPr>
-          <w:lang w:val="fr-CA"/>
-        </w:rPr>
-      </w:pPr>
-      <w:r>
-        <w:rPr>
-          <w:b/>
-          <w:bCs/>
           <w:lang w:val="fr-CA"/>
         </w:rPr>
         <w:t xml:space="preserve">➢ ORM : </w:t>
@@ -1805,21 +1476,7 @@
         <w:rPr>
           <w:lang w:val="fr-CA"/>
         </w:rPr>
-        <w:t>Object-</w:t>
-      </w:r>
-      <w:proofErr w:type="spellStart"/>
-      <w:r>
-        <w:rPr>
-          <w:lang w:val="fr-CA"/>
-        </w:rPr>
-        <w:t>Relational</w:t>
-      </w:r>
-      <w:proofErr w:type="spellEnd"/>
-      <w:r>
-        <w:rPr>
-          <w:lang w:val="fr-CA"/>
-        </w:rPr>
-        <w:t xml:space="preserve"> Mapping</w:t>
+        <w:t>Object-Relational Mapping</w:t>
       </w:r>
     </w:p>
     <w:p>
@@ -3356,63 +3013,7 @@
         <w:rPr>
           <w:lang w:val="fr-CA"/>
         </w:rPr>
-        <w:t xml:space="preserve">C'est dans ce contexte qu'est né le projet </w:t>
-      </w:r>
-      <w:proofErr w:type="spellStart"/>
-      <w:r>
-        <w:rPr>
-          <w:lang w:val="fr-CA"/>
-        </w:rPr>
-        <w:t>InvoiceAI</w:t>
-      </w:r>
-      <w:proofErr w:type="spellEnd"/>
-      <w:r>
-        <w:rPr>
-          <w:lang w:val="fr-CA"/>
-        </w:rPr>
-        <w:t xml:space="preserve">, une application intelligente conçue pour les ateliers de couture, qui combine une interface mobile Flutter, une API </w:t>
-      </w:r>
-      <w:proofErr w:type="spellStart"/>
-      <w:r>
-        <w:rPr>
-          <w:lang w:val="fr-CA"/>
-        </w:rPr>
-        <w:t>Laravel</w:t>
-      </w:r>
-      <w:proofErr w:type="spellEnd"/>
-      <w:r>
-        <w:rPr>
-          <w:lang w:val="fr-CA"/>
-        </w:rPr>
-        <w:t xml:space="preserve"> robuste et la puissance de l'intelligence artificielle de </w:t>
-      </w:r>
-      <w:proofErr w:type="spellStart"/>
-      <w:r>
-        <w:rPr>
-          <w:lang w:val="fr-CA"/>
-        </w:rPr>
-        <w:t>ChatGPT</w:t>
-      </w:r>
-      <w:proofErr w:type="spellEnd"/>
-      <w:r>
-        <w:rPr>
-          <w:lang w:val="fr-CA"/>
-        </w:rPr>
-        <w:t xml:space="preserve"> (</w:t>
-      </w:r>
-      <w:proofErr w:type="spellStart"/>
-      <w:r>
-        <w:rPr>
-          <w:lang w:val="fr-CA"/>
-        </w:rPr>
-        <w:t>OpenAI</w:t>
-      </w:r>
-      <w:proofErr w:type="spellEnd"/>
-      <w:r>
-        <w:rPr>
-          <w:lang w:val="fr-CA"/>
-        </w:rPr>
-        <w:t>) afin de permettre à tout tailleur ou couturière de générer un devis ou une facture professionnelle en quelques secondes, sans compétence comptable ni informatique préalable.</w:t>
+        <w:t>C'est dans ce contexte qu'est né le projet InvoiceAI, une application intelligente conçue pour les ateliers de couture, qui combine une interface mobile Flutter, une API Laravel robuste et la puissance de l'intelligence artificielle de ChatGPT (OpenAI) afin de permettre à tout tailleur ou couturière de générer un devis ou une facture professionnelle en quelques secondes, sans compétence comptable ni informatique préalable.</w:t>
       </w:r>
     </w:p>
     <w:p>
@@ -3422,19 +3023,11 @@
           <w:lang w:val="fr-CA"/>
         </w:rPr>
       </w:pPr>
-      <w:proofErr w:type="spellStart"/>
-      <w:r>
-        <w:rPr>
-          <w:lang w:val="fr-CA"/>
-        </w:rPr>
-        <w:t>InvoiceAI</w:t>
-      </w:r>
-      <w:proofErr w:type="spellEnd"/>
-      <w:r>
-        <w:rPr>
-          <w:lang w:val="fr-CA"/>
-        </w:rPr>
-        <w:t xml:space="preserve"> se positionne comme une solution destinée spécifiquement au métier de la couture, avec un avantage concret et immédiat pour l'atelier : plus de temps consacré à la confection et moins à la paperasse, des devis et factures professionnels générés en quelques secondes, un suivi fiable des mesures et de l'historique de chaque client, une visibilité claire sur les acomptes perçus et les soldes restant dus, et une réduction des litiges liés à un prix mal noté ou oublié. Elle permet la création de devis et factures assistée par IA — intégrant tissu, façon (main d'œuvre), mesures et délai de livraison — mais également la gestion du portefeuille clients, le suivi des acomptes et soldes, la génération automatique de documents PDF professionnels, l'envoi par email et le suivi de l'activité de l'atelier via un tableau de bord.</w:t>
+      <w:r>
+        <w:rPr>
+          <w:lang w:val="fr-CA"/>
+        </w:rPr>
+        <w:t>InvoiceAI se positionne comme une solution destinée spécifiquement au métier de la couture, avec un avantage concret et immédiat pour l'atelier : plus de temps consacré à la confection et moins à la paperasse, des devis et factures professionnels générés en quelques secondes, un suivi fiable des mesures et de l'historique de chaque client, une visibilité claire sur les acomptes perçus et les soldes restant dus, et une réduction des litiges liés à un prix mal noté ou oublié. Elle permet la création de devis et factures assistée par IA — intégrant tissu, façon (main d'œuvre), mesures et délai de livraison — mais également la gestion du portefeuille clients, le suivi des acomptes et soldes, la génération automatique de documents PDF professionnels, l'envoi par email et le suivi de l'activité de l'atelier via un tableau de bord.</w:t>
       </w:r>
     </w:p>
     <w:p>
@@ -3448,63 +3041,7 @@
         <w:rPr>
           <w:lang w:val="fr-CA"/>
         </w:rPr>
-        <w:t xml:space="preserve">Sur le plan technique, </w:t>
-      </w:r>
-      <w:proofErr w:type="spellStart"/>
-      <w:r>
-        <w:rPr>
-          <w:lang w:val="fr-CA"/>
-        </w:rPr>
-        <w:t>InvoiceAI</w:t>
-      </w:r>
-      <w:proofErr w:type="spellEnd"/>
-      <w:r>
-        <w:rPr>
-          <w:lang w:val="fr-CA"/>
-        </w:rPr>
-        <w:t xml:space="preserve"> repose sur une architecture moderne : une application mobile Flutter pour une expérience utilisateur fluide et accessible directement en atelier, une API </w:t>
-      </w:r>
-      <w:proofErr w:type="spellStart"/>
-      <w:r>
-        <w:rPr>
-          <w:lang w:val="fr-CA"/>
-        </w:rPr>
-        <w:t>Laravel</w:t>
-      </w:r>
-      <w:proofErr w:type="spellEnd"/>
-      <w:r>
-        <w:rPr>
-          <w:lang w:val="fr-CA"/>
-        </w:rPr>
-        <w:t xml:space="preserve"> 11 pour la gestion des données et de la logique métier, une base de données MySQL pour le stockage structuré des informations, et une intégration à l'API </w:t>
-      </w:r>
-      <w:proofErr w:type="spellStart"/>
-      <w:r>
-        <w:rPr>
-          <w:lang w:val="fr-CA"/>
-        </w:rPr>
-        <w:t>ChatGPT</w:t>
-      </w:r>
-      <w:proofErr w:type="spellEnd"/>
-      <w:r>
-        <w:rPr>
-          <w:lang w:val="fr-CA"/>
-        </w:rPr>
-        <w:t xml:space="preserve"> (</w:t>
-      </w:r>
-      <w:proofErr w:type="spellStart"/>
-      <w:r>
-        <w:rPr>
-          <w:lang w:val="fr-CA"/>
-        </w:rPr>
-        <w:t>OpenAI</w:t>
-      </w:r>
-      <w:proofErr w:type="spellEnd"/>
-      <w:r>
-        <w:rPr>
-          <w:lang w:val="fr-CA"/>
-        </w:rPr>
-        <w:t>) pour l'analyse et la structuration du texte ou de la voix saisis par le tailleur.</w:t>
+        <w:t>Sur le plan technique, InvoiceAI repose sur une architecture moderne : une application mobile Flutter pour une expérience utilisateur fluide et accessible directement en atelier, une API Laravel 11 pour la gestion des données et de la logique métier, une base de données MySQL pour le stockage structuré des informations, et une intégration à l'API ChatGPT (OpenAI) pour l'analyse et la structuration du texte ou de la voix saisis par le tailleur.</w:t>
       </w:r>
     </w:p>
     <w:p>
@@ -3518,21 +3055,7 @@
         <w:rPr>
           <w:lang w:val="fr-CA"/>
         </w:rPr>
-        <w:t>Le présent rapport rend compte de l'ensemble du travail réalisé dans le cadre du développement d'</w:t>
-      </w:r>
-      <w:proofErr w:type="spellStart"/>
-      <w:r>
-        <w:rPr>
-          <w:lang w:val="fr-CA"/>
-        </w:rPr>
-        <w:t>InvoiceAI</w:t>
-      </w:r>
-      <w:proofErr w:type="spellEnd"/>
-      <w:r>
-        <w:rPr>
-          <w:lang w:val="fr-CA"/>
-        </w:rPr>
-        <w:t>. Il expose d'abord la description du projet — son contexte, ses objectifs et les résultats attendus pour l'atelier de couture — avant de détailler la présentation de la solution proposée, son architecture fonctionnelle et technique, ainsi que les outils utilisés. Une dernière partie sera consacrée à la réalisation concrète du projet, aux résultats obtenus, aux difficultés rencontrées et aux perspectives d'évolution envisagées.</w:t>
+        <w:t>Le présent rapport rend compte de l'ensemble du travail réalisé dans le cadre du développement d'InvoiceAI. Il expose d'abord la description du projet — son contexte, ses objectifs et les résultats attendus pour l'atelier de couture — avant de détailler la présentation de la solution proposée, son architecture fonctionnelle et technique, ainsi que les outils utilisés. Une dernière partie sera consacrée à la réalisation concrète du projet, aux résultats obtenus, aux difficultés rencontrées et aux perspectives d'évolution envisagées.</w:t>
       </w:r>
     </w:p>
     <w:p>
@@ -3625,21 +3148,7 @@
         <w:rPr>
           <w:lang w:val="fr-CA"/>
         </w:rPr>
-        <w:t>Face à ce constat, la mise en place d'une solution capable de comprendre le langage naturel — écrit ou dicté — et de transformer une simple description de commande en un devis ou une facture structurée s'impose comme une réponse pertinente et innovante. C'est cette ambition qui a motivé la conception d'</w:t>
-      </w:r>
-      <w:proofErr w:type="spellStart"/>
-      <w:r>
-        <w:rPr>
-          <w:lang w:val="fr-CA"/>
-        </w:rPr>
-        <w:t>InvoiceAI</w:t>
-      </w:r>
-      <w:proofErr w:type="spellEnd"/>
-      <w:r>
-        <w:rPr>
-          <w:lang w:val="fr-CA"/>
-        </w:rPr>
-        <w:t xml:space="preserve"> : une application où le tailleur décrit simplement « ce qu'il a confectionné, pour qui, avec quel tissu et à quel prix », et où l'intelligence artificielle se charge d'extraire et de structurer automatiquement les informations nécessaires à la génération du document.</w:t>
+        <w:t>Face à ce constat, la mise en place d'une solution capable de comprendre le langage naturel — écrit ou dicté — et de transformer une simple description de commande en un devis ou une facture structurée s'impose comme une réponse pertinente et innovante. C'est cette ambition qui a motivé la conception d'InvoiceAI : une application où le tailleur décrit simplement « ce qu'il a confectionné, pour qui, avec quel tissu et à quel prix », et où l'intelligence artificielle se charge d'extraire et de structurer automatiquement les informations nécessaires à la génération du document.</w:t>
       </w:r>
     </w:p>
     <w:p>
@@ -3653,21 +3162,7 @@
         <w:rPr>
           <w:lang w:val="fr-CA"/>
         </w:rPr>
-        <w:t xml:space="preserve">Le choix de développer </w:t>
-      </w:r>
-      <w:proofErr w:type="spellStart"/>
-      <w:r>
-        <w:rPr>
-          <w:lang w:val="fr-CA"/>
-        </w:rPr>
-        <w:t>InvoiceAI</w:t>
-      </w:r>
-      <w:proofErr w:type="spellEnd"/>
-      <w:r>
-        <w:rPr>
-          <w:lang w:val="fr-CA"/>
-        </w:rPr>
-        <w:t xml:space="preserve"> pour ce secteur repose sur plusieurs justifications : répondre à un besoin réel de simplification de la facturation pour des artisans non-initiés à la comptabilité ; valoriser un savoir-faire artisanal en lui donnant des outils de gestion aussi professionnels que ceux des grandes maisons de couture ; et démontrer, à travers un cas d'usage concret et sectoriel, l'apport de l'intelligence artificielle générative dans l'automatisation de tâches administratives propres à un métier précis.</w:t>
+        <w:t>Le choix de développer InvoiceAI pour ce secteur repose sur plusieurs justifications : répondre à un besoin réel de simplification de la facturation pour des artisans non-initiés à la comptabilité ; valoriser un savoir-faire artisanal en lui donnant des outils de gestion aussi professionnels que ceux des grandes maisons de couture ; et démontrer, à travers un cas d'usage concret et sectoriel, l'apport de l'intelligence artificielle générative dans l'automatisation de tâches administratives propres à un métier précis.</w:t>
       </w:r>
     </w:p>
     <w:p>
@@ -3709,21 +3204,7 @@
         <w:rPr>
           <w:lang w:val="fr-CA"/>
         </w:rPr>
-        <w:t xml:space="preserve">Développer une application mobile intelligente, connectée à une API </w:t>
-      </w:r>
-      <w:proofErr w:type="spellStart"/>
-      <w:r>
-        <w:rPr>
-          <w:lang w:val="fr-CA"/>
-        </w:rPr>
-        <w:t>Laravel</w:t>
-      </w:r>
-      <w:proofErr w:type="spellEnd"/>
-      <w:r>
-        <w:rPr>
-          <w:lang w:val="fr-CA"/>
-        </w:rPr>
-        <w:t>, permettant à tout tailleur ou couturière de créer, envoyer et suivre ses devis et factures via une interface simple, rapide et intuitive, adaptée aux réalités d'un atelier de couture.</w:t>
+        <w:t>Développer une application mobile intelligente, connectée à une API Laravel, permettant à tout tailleur ou couturière de créer, envoyer et suivre ses devis et factures via une interface simple, rapide et intuitive, adaptée aux réalités d'un atelier de couture.</w:t>
       </w:r>
     </w:p>
     <w:p>
@@ -3731,21 +3212,8 @@
         <w:pStyle w:val="Titre3"/>
       </w:pPr>
       <w:r>
-        <w:t xml:space="preserve">2.2 </w:t>
-      </w:r>
-      <w:proofErr w:type="spellStart"/>
-      <w:r>
-        <w:t>Objectifs</w:t>
-      </w:r>
-      <w:proofErr w:type="spellEnd"/>
-      <w:r>
-        <w:t xml:space="preserve"> </w:t>
-      </w:r>
-      <w:proofErr w:type="spellStart"/>
-      <w:r>
-        <w:t>spécifiques</w:t>
-      </w:r>
-      <w:proofErr w:type="spellEnd"/>
+        <w:t>2.2 Objectifs spécifiques</w:t>
+      </w:r>
     </w:p>
     <w:p>
       <w:pPr>
@@ -3932,15 +3400,7 @@
         <w:pStyle w:val="Titre3"/>
       </w:pPr>
       <w:r>
-        <w:t xml:space="preserve">2.3 </w:t>
-      </w:r>
-      <w:proofErr w:type="spellStart"/>
-      <w:r>
-        <w:t>Objectifs</w:t>
-      </w:r>
-      <w:proofErr w:type="spellEnd"/>
-      <w:r>
-        <w:t xml:space="preserve"> à long terme</w:t>
+        <w:t>2.3 Objectifs à long terme</w:t>
       </w:r>
     </w:p>
     <w:p>
@@ -4049,21 +3509,7 @@
         <w:rPr>
           <w:lang w:val="fr-CA"/>
         </w:rPr>
-        <w:t xml:space="preserve">Faire évoluer </w:t>
-      </w:r>
-      <w:proofErr w:type="spellStart"/>
-      <w:r>
-        <w:rPr>
-          <w:lang w:val="fr-CA"/>
-        </w:rPr>
-        <w:t>InvoiceAI</w:t>
-      </w:r>
-      <w:proofErr w:type="spellEnd"/>
-      <w:r>
-        <w:rPr>
-          <w:lang w:val="fr-CA"/>
-        </w:rPr>
-        <w:t xml:space="preserve"> vers un véritable modèle d'abonnement SaaS (offres gratuite, pro, entreprise) destiné aux ateliers de couture ;</w:t>
+        <w:t>Faire évoluer InvoiceAI vers un véritable modèle d'abonnement SaaS (offres gratuite, pro, entreprise) destiné aux ateliers de couture ;</w:t>
       </w:r>
     </w:p>
     <w:p>
@@ -4119,19 +3565,11 @@
           <w:lang w:val="fr-CA"/>
         </w:rPr>
       </w:pPr>
-      <w:proofErr w:type="spellStart"/>
-      <w:r>
-        <w:rPr>
-          <w:lang w:val="fr-CA"/>
-        </w:rPr>
-        <w:t>InvoiceAI</w:t>
-      </w:r>
-      <w:proofErr w:type="spellEnd"/>
-      <w:r>
-        <w:rPr>
-          <w:lang w:val="fr-CA"/>
-        </w:rPr>
-        <w:t xml:space="preserve"> doit permettre de réduire drastiquement le temps nécessaire à la rédaction d'un devis ou d'une facture de couture, tout en éliminant les erreurs de calcul et les oublis de mesures grâce à l'automatisation des totaux, de la TVA et de l'archivage des informations client — un gain de temps directement réinvesti dans la confection.</w:t>
+      <w:r>
+        <w:rPr>
+          <w:lang w:val="fr-CA"/>
+        </w:rPr>
+        <w:t>InvoiceAI doit permettre de réduire drastiquement le temps nécessaire à la rédaction d'un devis ou d'une facture de couture, tout en éliminant les erreurs de calcul et les oublis de mesures grâce à l'automatisation des totaux, de la TVA et de l'archivage des informations client — un gain de temps directement réinvesti dans la confection.</w:t>
       </w:r>
     </w:p>
     <w:p>
@@ -4271,21 +3709,7 @@
         <w:rPr>
           <w:lang w:val="fr-CA"/>
         </w:rPr>
-        <w:t xml:space="preserve">Au-delà du MVP, </w:t>
-      </w:r>
-      <w:proofErr w:type="spellStart"/>
-      <w:r>
-        <w:rPr>
-          <w:lang w:val="fr-CA"/>
-        </w:rPr>
-        <w:t>InvoiceAI</w:t>
-      </w:r>
-      <w:proofErr w:type="spellEnd"/>
-      <w:r>
-        <w:rPr>
-          <w:lang w:val="fr-CA"/>
-        </w:rPr>
-        <w:t xml:space="preserve"> doit pouvoir évoluer vers un produit commercialisable auprès des ateliers de couture, avec un modèle économique SaaS viable et une base d'utilisateurs élargie au fil des futures versions, contribuant ainsi à la modernisation durable d'un métier artisanal.</w:t>
+        <w:t>Au-delà du MVP, InvoiceAI doit pouvoir évoluer vers un produit commercialisable auprès des ateliers de couture, avec un modèle économique SaaS viable et une base d'utilisateurs élargie au fil des futures versions, contribuant ainsi à la modernisation durable d'un métier artisanal.</w:t>
       </w:r>
     </w:p>
     <w:p>
@@ -4323,75 +3747,11 @@
           <w:lang w:val="fr-CA"/>
         </w:rPr>
       </w:pPr>
-      <w:proofErr w:type="spellStart"/>
-      <w:r>
-        <w:rPr>
-          <w:lang w:val="fr-CA"/>
-        </w:rPr>
-        <w:t>InvoiceAI</w:t>
-      </w:r>
-      <w:proofErr w:type="spellEnd"/>
-      <w:r>
-        <w:rPr>
-          <w:lang w:val="fr-CA"/>
-        </w:rPr>
-        <w:t xml:space="preserve"> est une application intelligente, mobile (Flutter) et connectée à une API </w:t>
-      </w:r>
-      <w:proofErr w:type="spellStart"/>
-      <w:r>
-        <w:rPr>
-          <w:lang w:val="fr-CA"/>
-        </w:rPr>
-        <w:t>Laravel</w:t>
-      </w:r>
-      <w:proofErr w:type="spellEnd"/>
-      <w:r>
-        <w:rPr>
-          <w:lang w:val="fr-CA"/>
-        </w:rPr>
-        <w:t xml:space="preserve">, conçue spécifiquement pour les ateliers de couture : tailleurs, couturières et stylistes-modélistes. Elle permet de créer un devis ou une facture en décrivant — au clavier ou à la voix — la commande en langage naturel : l'application transmet le texte à l'API </w:t>
-      </w:r>
-      <w:proofErr w:type="spellStart"/>
-      <w:r>
-        <w:rPr>
-          <w:lang w:val="fr-CA"/>
-        </w:rPr>
-        <w:t>Laravel</w:t>
-      </w:r>
-      <w:proofErr w:type="spellEnd"/>
-      <w:r>
-        <w:rPr>
-          <w:lang w:val="fr-CA"/>
-        </w:rPr>
-        <w:t xml:space="preserve">, qui l'analyse grâce à l'intelligence artificielle de </w:t>
-      </w:r>
-      <w:proofErr w:type="spellStart"/>
-      <w:r>
-        <w:rPr>
-          <w:lang w:val="fr-CA"/>
-        </w:rPr>
-        <w:t>ChatGPT</w:t>
-      </w:r>
-      <w:proofErr w:type="spellEnd"/>
-      <w:r>
-        <w:rPr>
-          <w:lang w:val="fr-CA"/>
-        </w:rPr>
-        <w:t xml:space="preserve"> (</w:t>
-      </w:r>
-      <w:proofErr w:type="spellStart"/>
-      <w:r>
-        <w:rPr>
-          <w:lang w:val="fr-CA"/>
-        </w:rPr>
-        <w:t>OpenAI</w:t>
-      </w:r>
-      <w:proofErr w:type="spellEnd"/>
-      <w:r>
-        <w:rPr>
-          <w:lang w:val="fr-CA"/>
-        </w:rPr>
-        <w:t>) pour en extraire les informations pertinentes (client, type de vêtement, tissu, façon, accessoires, quantités, prix), puis génère un document structuré, calculé et exportable en PDF, prêt à être remis ou envoyé au client par email.</w:t>
+      <w:r>
+        <w:rPr>
+          <w:lang w:val="fr-CA"/>
+        </w:rPr>
+        <w:t>InvoiceAI est une application intelligente, mobile (Flutter) et connectée à une API Laravel, conçue spécifiquement pour les ateliers de couture : tailleurs, couturières et stylistes-modélistes. Elle permet de créer un devis ou une facture en décrivant — au clavier ou à la voix — la commande en langage naturel : l'application transmet le texte à l'API Laravel, qui l'analyse grâce à l'intelligence artificielle de ChatGPT (OpenAI) pour en extraire les informations pertinentes (client, type de vêtement, tissu, façon, accessoires, quantités, prix), puis génère un document structuré, calculé et exportable en PDF, prêt à être remis ou envoyé au client par email.</w:t>
       </w:r>
     </w:p>
     <w:p>
@@ -4405,21 +3765,7 @@
         <w:rPr>
           <w:lang w:val="fr-CA"/>
         </w:rPr>
-        <w:t xml:space="preserve">Exemple d'utilisation : le tailleur dicte ou saisit « J'ai confectionné 2 boubous brodés pour Fatou Diop, tissu bazin fourni par la cliente, façon à 20 000 FCFA le boubou, plus 5 000 FCFA de broderie, acompte de 15 000 FCFA déjà versé, livraison dans 5 jours ». </w:t>
-      </w:r>
-      <w:proofErr w:type="spellStart"/>
-      <w:r>
-        <w:rPr>
-          <w:lang w:val="fr-CA"/>
-        </w:rPr>
-        <w:t>InvoiceAI</w:t>
-      </w:r>
-      <w:proofErr w:type="spellEnd"/>
-      <w:r>
-        <w:rPr>
-          <w:lang w:val="fr-CA"/>
-        </w:rPr>
-        <w:t xml:space="preserve"> génère automatiquement un devis avec la cliente identifiée, les lignes de détail (façon, broderie), le total, l'acompte déduit, le solde restant et la date de livraison, avant de produire le PDF et de l'envoyer par email.</w:t>
+        <w:t>Exemple d'utilisation : le tailleur dicte ou saisit « J'ai confectionné 2 boubous brodés pour Fatou Diop, tissu bazin fourni par la cliente, façon à 20 000 FCFA le boubou, plus 5 000 FCFA de broderie, acompte de 15 000 FCFA déjà versé, livraison dans 5 jours ». InvoiceAI génère automatiquement un devis avec la cliente identifiée, les lignes de détail (façon, broderie), le total, l'acompte déduit, le solde restant et la date de livraison, avant de produire le PDF et de l'envoyer par email.</w:t>
       </w:r>
     </w:p>
     <w:p>
@@ -4466,35 +3812,7 @@
           <w:lang w:val="fr-CA"/>
         </w:rPr>
         <w:lastRenderedPageBreak/>
-        <w:t xml:space="preserve">Inscription et connexion sécurisées depuis l'application Flutter (API </w:t>
-      </w:r>
-      <w:proofErr w:type="spellStart"/>
-      <w:r>
-        <w:rPr>
-          <w:lang w:val="fr-CA"/>
-        </w:rPr>
-        <w:t>Laravel</w:t>
-      </w:r>
-      <w:proofErr w:type="spellEnd"/>
-      <w:r>
-        <w:rPr>
-          <w:lang w:val="fr-CA"/>
-        </w:rPr>
-        <w:t xml:space="preserve"> + authentification par </w:t>
-      </w:r>
-      <w:proofErr w:type="spellStart"/>
-      <w:r>
-        <w:rPr>
-          <w:lang w:val="fr-CA"/>
-        </w:rPr>
-        <w:t>token</w:t>
-      </w:r>
-      <w:proofErr w:type="spellEnd"/>
-      <w:r>
-        <w:rPr>
-          <w:lang w:val="fr-CA"/>
-        </w:rPr>
-        <w:t>) ;</w:t>
+        <w:t>Inscription et connexion sécurisées depuis l'application Flutter (API Laravel + authentification par token) ;</w:t>
       </w:r>
     </w:p>
     <w:p>
@@ -4580,49 +3898,7 @@
         <w:rPr>
           <w:lang w:val="fr-CA"/>
         </w:rPr>
-        <w:t xml:space="preserve">Analyse automatique du texte via l'API </w:t>
-      </w:r>
-      <w:proofErr w:type="spellStart"/>
-      <w:r>
-        <w:rPr>
-          <w:lang w:val="fr-CA"/>
-        </w:rPr>
-        <w:t>ChatGPT</w:t>
-      </w:r>
-      <w:proofErr w:type="spellEnd"/>
-      <w:r>
-        <w:rPr>
-          <w:lang w:val="fr-CA"/>
-        </w:rPr>
-        <w:t xml:space="preserve"> (</w:t>
-      </w:r>
-      <w:proofErr w:type="spellStart"/>
-      <w:r>
-        <w:rPr>
-          <w:lang w:val="fr-CA"/>
-        </w:rPr>
-        <w:t>OpenAI</w:t>
-      </w:r>
-      <w:proofErr w:type="spellEnd"/>
-      <w:r>
-        <w:rPr>
-          <w:lang w:val="fr-CA"/>
-        </w:rPr>
-        <w:t xml:space="preserve">), appelée depuis le backend </w:t>
-      </w:r>
-      <w:proofErr w:type="spellStart"/>
-      <w:r>
-        <w:rPr>
-          <w:lang w:val="fr-CA"/>
-        </w:rPr>
-        <w:t>Laravel</w:t>
-      </w:r>
-      <w:proofErr w:type="spellEnd"/>
-      <w:r>
-        <w:rPr>
-          <w:lang w:val="fr-CA"/>
-        </w:rPr>
-        <w:t xml:space="preserve"> ;</w:t>
+        <w:t>Analyse automatique du texte via l'API ChatGPT (OpenAI), appelée depuis le backend Laravel ;</w:t>
       </w:r>
     </w:p>
     <w:p>
@@ -4734,15 +4010,7 @@
         <w:pStyle w:val="Titre3"/>
       </w:pPr>
       <w:r>
-        <w:t xml:space="preserve">2.4 </w:t>
-      </w:r>
-      <w:proofErr w:type="spellStart"/>
-      <w:r>
-        <w:t>Génération</w:t>
-      </w:r>
-      <w:proofErr w:type="spellEnd"/>
-      <w:r>
-        <w:t xml:space="preserve"> de documents PDF</w:t>
+        <w:t>2.4 Génération de documents PDF</w:t>
       </w:r>
     </w:p>
     <w:p>
@@ -4778,21 +4046,7 @@
         <w:rPr>
           <w:lang w:val="fr-CA"/>
         </w:rPr>
-        <w:t>Génération côté serveur (</w:t>
-      </w:r>
-      <w:proofErr w:type="spellStart"/>
-      <w:r>
-        <w:rPr>
-          <w:lang w:val="fr-CA"/>
-        </w:rPr>
-        <w:t>DomPDF</w:t>
-      </w:r>
-      <w:proofErr w:type="spellEnd"/>
-      <w:r>
-        <w:rPr>
-          <w:lang w:val="fr-CA"/>
-        </w:rPr>
-        <w:t>) et téléchargement immédiat depuis l'application Flutter.</w:t>
+        <w:t>Génération côté serveur (DomPDF) et téléchargement immédiat depuis l'application Flutter.</w:t>
       </w:r>
     </w:p>
     <w:p>
@@ -4844,15 +4098,7 @@
         <w:pStyle w:val="Titre3"/>
       </w:pPr>
       <w:r>
-        <w:t xml:space="preserve">2.6 Envoi </w:t>
-      </w:r>
-      <w:proofErr w:type="spellStart"/>
-      <w:r>
-        <w:t>automatique</w:t>
-      </w:r>
-      <w:proofErr w:type="spellEnd"/>
-      <w:r>
-        <w:t xml:space="preserve"> par email</w:t>
+        <w:t>2.6 Envoi automatique par email</w:t>
       </w:r>
     </w:p>
     <w:p>
@@ -4870,21 +4116,7 @@
         <w:rPr>
           <w:lang w:val="fr-CA"/>
         </w:rPr>
-        <w:t xml:space="preserve">Envoi du PDF au client après validation, en tâche asynchrone via </w:t>
-      </w:r>
-      <w:proofErr w:type="spellStart"/>
-      <w:r>
-        <w:rPr>
-          <w:lang w:val="fr-CA"/>
-        </w:rPr>
-        <w:t>Laravel</w:t>
-      </w:r>
-      <w:proofErr w:type="spellEnd"/>
-      <w:r>
-        <w:rPr>
-          <w:lang w:val="fr-CA"/>
-        </w:rPr>
-        <w:t xml:space="preserve"> Queues ;</w:t>
+        <w:t>Envoi du PDF au client après validation, en tâche asynchrone via Laravel Queues ;</w:t>
       </w:r>
     </w:p>
     <w:p>
@@ -5054,13 +4286,8 @@
         <w:pStyle w:val="Titre3"/>
       </w:pPr>
       <w:r>
-        <w:t xml:space="preserve">b) Modules </w:t>
-      </w:r>
-      <w:proofErr w:type="spellStart"/>
-      <w:r>
-        <w:t>principaux</w:t>
-      </w:r>
-      <w:proofErr w:type="spellEnd"/>
+        <w:t>b) Modules principaux</w:t>
+      </w:r>
     </w:p>
     <w:p>
       <w:pPr>
@@ -5119,15 +4346,7 @@
         </w:numPr>
       </w:pPr>
       <w:r>
-        <w:t xml:space="preserve">Module </w:t>
-      </w:r>
-      <w:proofErr w:type="spellStart"/>
-      <w:r>
-        <w:t>Génération</w:t>
-      </w:r>
-      <w:proofErr w:type="spellEnd"/>
-      <w:r>
-        <w:t xml:space="preserve"> PDF ;</w:t>
+        <w:t>Module Génération PDF ;</w:t>
       </w:r>
     </w:p>
     <w:p>
@@ -5740,47 +4959,7 @@
           <w:sz w:val="19"/>
           <w:lang w:val="fr-CA"/>
         </w:rPr>
-        <w:t xml:space="preserve">Figure — Diagramme de séquence : saisie intelligente assistée par IA (Flutter → </w:t>
-      </w:r>
-      <w:proofErr w:type="spellStart"/>
-      <w:r>
-        <w:rPr>
-          <w:i/>
-          <w:color w:val="555555"/>
-          <w:sz w:val="19"/>
-          <w:lang w:val="fr-CA"/>
-        </w:rPr>
-        <w:t>Laravel</w:t>
-      </w:r>
-      <w:proofErr w:type="spellEnd"/>
-      <w:r>
-        <w:rPr>
-          <w:i/>
-          <w:color w:val="555555"/>
-          <w:sz w:val="19"/>
-          <w:lang w:val="fr-CA"/>
-        </w:rPr>
-        <w:t xml:space="preserve"> → </w:t>
-      </w:r>
-      <w:proofErr w:type="spellStart"/>
-      <w:r>
-        <w:rPr>
-          <w:i/>
-          <w:color w:val="555555"/>
-          <w:sz w:val="19"/>
-          <w:lang w:val="fr-CA"/>
-        </w:rPr>
-        <w:t>ChatGPT</w:t>
-      </w:r>
-      <w:proofErr w:type="spellEnd"/>
-      <w:r>
-        <w:rPr>
-          <w:i/>
-          <w:color w:val="555555"/>
-          <w:sz w:val="19"/>
-          <w:lang w:val="fr-CA"/>
-        </w:rPr>
-        <w:t>).</w:t>
+        <w:t>Figure — Diagramme de séquence : saisie intelligente assistée par IA (Flutter → Laravel → ChatGPT).</w:t>
       </w:r>
     </w:p>
     <w:p>
@@ -5851,15 +5030,7 @@
         <w:pStyle w:val="Titre3"/>
       </w:pPr>
       <w:r>
-        <w:t xml:space="preserve">c) </w:t>
-      </w:r>
-      <w:proofErr w:type="spellStart"/>
-      <w:r>
-        <w:t>Diagrammes</w:t>
-      </w:r>
-      <w:proofErr w:type="spellEnd"/>
-      <w:r>
-        <w:t xml:space="preserve"> de classes</w:t>
+        <w:t>c) Diagrammes de classes</w:t>
       </w:r>
     </w:p>
     <w:p>
@@ -5992,21 +5163,8 @@
         <w:pStyle w:val="Titre3"/>
       </w:pPr>
       <w:r>
-        <w:t xml:space="preserve">d) </w:t>
-      </w:r>
-      <w:proofErr w:type="spellStart"/>
-      <w:r>
-        <w:t>Diagramme</w:t>
-      </w:r>
-      <w:proofErr w:type="spellEnd"/>
-      <w:r>
-        <w:t xml:space="preserve"> de </w:t>
-      </w:r>
-      <w:proofErr w:type="spellStart"/>
-      <w:r>
-        <w:t>déploiement</w:t>
-      </w:r>
-      <w:proofErr w:type="spellEnd"/>
+        <w:t>d) Diagramme de déploiement</w:t>
+      </w:r>
     </w:p>
     <w:p>
       <w:pPr>
@@ -6067,67 +5225,7 @@
           <w:sz w:val="19"/>
           <w:lang w:val="fr-CA"/>
         </w:rPr>
-        <w:t>Figure — Diagramme de déploiement : infrastructure complète d'</w:t>
-      </w:r>
-      <w:proofErr w:type="spellStart"/>
-      <w:r>
-        <w:rPr>
-          <w:i/>
-          <w:color w:val="555555"/>
-          <w:sz w:val="19"/>
-          <w:lang w:val="fr-CA"/>
-        </w:rPr>
-        <w:t>InvoiceAI</w:t>
-      </w:r>
-      <w:proofErr w:type="spellEnd"/>
-      <w:r>
-        <w:rPr>
-          <w:i/>
-          <w:color w:val="555555"/>
-          <w:sz w:val="19"/>
-          <w:lang w:val="fr-CA"/>
-        </w:rPr>
-        <w:t xml:space="preserve"> (Flutter, </w:t>
-      </w:r>
-      <w:proofErr w:type="spellStart"/>
-      <w:r>
-        <w:rPr>
-          <w:i/>
-          <w:color w:val="555555"/>
-          <w:sz w:val="19"/>
-          <w:lang w:val="fr-CA"/>
-        </w:rPr>
-        <w:t>Laravel</w:t>
-      </w:r>
-      <w:proofErr w:type="spellEnd"/>
-      <w:r>
-        <w:rPr>
-          <w:i/>
-          <w:color w:val="555555"/>
-          <w:sz w:val="19"/>
-          <w:lang w:val="fr-CA"/>
-        </w:rPr>
-        <w:t xml:space="preserve">, MySQL, </w:t>
-      </w:r>
-      <w:proofErr w:type="spellStart"/>
-      <w:r>
-        <w:rPr>
-          <w:i/>
-          <w:color w:val="555555"/>
-          <w:sz w:val="19"/>
-          <w:lang w:val="fr-CA"/>
-        </w:rPr>
-        <w:t>ChatGPT</w:t>
-      </w:r>
-      <w:proofErr w:type="spellEnd"/>
-      <w:r>
-        <w:rPr>
-          <w:i/>
-          <w:color w:val="555555"/>
-          <w:sz w:val="19"/>
-          <w:lang w:val="fr-CA"/>
-        </w:rPr>
-        <w:t>).</w:t>
+        <w:t>Figure — Diagramme de déploiement : infrastructure complète d'InvoiceAI (Flutter, Laravel, MySQL, ChatGPT).</w:t>
       </w:r>
     </w:p>
     <w:p>
@@ -6135,21 +5233,8 @@
         <w:pStyle w:val="Titre3"/>
       </w:pPr>
       <w:r>
-        <w:t xml:space="preserve">e) </w:t>
-      </w:r>
-      <w:proofErr w:type="spellStart"/>
-      <w:r>
-        <w:t>Diagramme</w:t>
-      </w:r>
-      <w:proofErr w:type="spellEnd"/>
-      <w:r>
-        <w:t xml:space="preserve"> de </w:t>
-      </w:r>
-      <w:proofErr w:type="spellStart"/>
-      <w:r>
-        <w:t>composants</w:t>
-      </w:r>
-      <w:proofErr w:type="spellEnd"/>
+        <w:t>e) Diagramme de composants</w:t>
+      </w:r>
     </w:p>
     <w:p>
       <w:pPr>
@@ -6211,27 +5296,7 @@
           <w:sz w:val="19"/>
           <w:lang w:val="fr-CA"/>
         </w:rPr>
-        <w:t>Figure — Diagramme de composants : architecture logicielle d'</w:t>
-      </w:r>
-      <w:proofErr w:type="spellStart"/>
-      <w:r>
-        <w:rPr>
-          <w:i/>
-          <w:color w:val="555555"/>
-          <w:sz w:val="19"/>
-          <w:lang w:val="fr-CA"/>
-        </w:rPr>
-        <w:t>InvoiceAI</w:t>
-      </w:r>
-      <w:proofErr w:type="spellEnd"/>
-      <w:r>
-        <w:rPr>
-          <w:i/>
-          <w:color w:val="555555"/>
-          <w:sz w:val="19"/>
-          <w:lang w:val="fr-CA"/>
-        </w:rPr>
-        <w:t>.</w:t>
+        <w:t>Figure — Diagramme de composants : architecture logicielle d'InvoiceAI.</w:t>
       </w:r>
     </w:p>
     <w:p>
@@ -6259,21 +5324,7 @@
         <w:rPr>
           <w:lang w:val="fr-CA"/>
         </w:rPr>
-        <w:t>Le schéma relationnel d'</w:t>
-      </w:r>
-      <w:proofErr w:type="spellStart"/>
-      <w:r>
-        <w:rPr>
-          <w:lang w:val="fr-CA"/>
-        </w:rPr>
-        <w:t>InvoiceAI</w:t>
-      </w:r>
-      <w:proofErr w:type="spellEnd"/>
-      <w:r>
-        <w:rPr>
-          <w:lang w:val="fr-CA"/>
-        </w:rPr>
-        <w:t xml:space="preserve"> repose sur quatre tables principales :</w:t>
+        <w:t>Le schéma relationnel d'InvoiceAI repose sur quatre tables principales :</w:t>
       </w:r>
     </w:p>
     <w:p>
@@ -6284,19 +5335,9 @@
           <w:numId w:val="2"/>
         </w:numPr>
       </w:pPr>
-      <w:proofErr w:type="gramStart"/>
-      <w:r>
-        <w:t>users :</w:t>
-      </w:r>
-      <w:proofErr w:type="gramEnd"/>
-      <w:r>
-        <w:t xml:space="preserve"> id, name, email, password, atelier_name, logo, tax_rate — possède plusieurs factures et </w:t>
-      </w:r>
-      <w:proofErr w:type="gramStart"/>
-      <w:r>
-        <w:t>clients ;</w:t>
-      </w:r>
-      <w:proofErr w:type="gramEnd"/>
+      <w:r>
+        <w:t>users : id, name, email, password, atelier_name, logo, tax_rate — possède plusieurs factures et clients ;</w:t>
+      </w:r>
     </w:p>
     <w:p>
       <w:pPr>
@@ -6309,61 +5350,11 @@
           <w:lang w:val="fr-CA"/>
         </w:rPr>
       </w:pPr>
-      <w:proofErr w:type="gramStart"/>
-      <w:r>
-        <w:rPr>
-          <w:lang w:val="fr-CA"/>
-        </w:rPr>
-        <w:t>clients</w:t>
-      </w:r>
-      <w:proofErr w:type="gramEnd"/>
-      <w:r>
-        <w:rPr>
-          <w:lang w:val="fr-CA"/>
-        </w:rPr>
-        <w:t xml:space="preserve"> : id, </w:t>
-      </w:r>
-      <w:proofErr w:type="spellStart"/>
-      <w:r>
-        <w:rPr>
-          <w:lang w:val="fr-CA"/>
-        </w:rPr>
-        <w:t>user_id</w:t>
-      </w:r>
-      <w:proofErr w:type="spellEnd"/>
-      <w:r>
-        <w:rPr>
-          <w:lang w:val="fr-CA"/>
-        </w:rPr>
-        <w:t xml:space="preserve">, </w:t>
-      </w:r>
-      <w:proofErr w:type="spellStart"/>
-      <w:r>
-        <w:rPr>
-          <w:lang w:val="fr-CA"/>
-        </w:rPr>
-        <w:t>name</w:t>
-      </w:r>
-      <w:proofErr w:type="spellEnd"/>
-      <w:r>
-        <w:rPr>
-          <w:lang w:val="fr-CA"/>
-        </w:rPr>
-        <w:t xml:space="preserve">, email, phone, </w:t>
-      </w:r>
-      <w:proofErr w:type="spellStart"/>
-      <w:r>
-        <w:rPr>
-          <w:lang w:val="fr-CA"/>
-        </w:rPr>
-        <w:t>address</w:t>
-      </w:r>
-      <w:proofErr w:type="spellEnd"/>
-      <w:r>
-        <w:rPr>
-          <w:lang w:val="fr-CA"/>
-        </w:rPr>
-        <w:t>, mesures (JSON) — appartient à un utilisateur, possède plusieurs factures ;</w:t>
+      <w:r>
+        <w:rPr>
+          <w:lang w:val="fr-CA"/>
+        </w:rPr>
+        <w:t>clients : id, user_id, name, email, phone, address, mesures (JSON) — appartient à un utilisateur, possède plusieurs factures ;</w:t>
       </w:r>
     </w:p>
     <w:p>
@@ -6377,105 +5368,11 @@
           <w:lang w:val="fr-CA"/>
         </w:rPr>
       </w:pPr>
-      <w:proofErr w:type="spellStart"/>
-      <w:proofErr w:type="gramStart"/>
-      <w:r>
-        <w:rPr>
-          <w:lang w:val="fr-CA"/>
-        </w:rPr>
-        <w:t>invoices</w:t>
-      </w:r>
-      <w:proofErr w:type="spellEnd"/>
-      <w:proofErr w:type="gramEnd"/>
-      <w:r>
-        <w:rPr>
-          <w:lang w:val="fr-CA"/>
-        </w:rPr>
-        <w:t xml:space="preserve"> : id, </w:t>
-      </w:r>
-      <w:proofErr w:type="spellStart"/>
-      <w:r>
-        <w:rPr>
-          <w:lang w:val="fr-CA"/>
-        </w:rPr>
-        <w:t>user_id</w:t>
-      </w:r>
-      <w:proofErr w:type="spellEnd"/>
-      <w:r>
-        <w:rPr>
-          <w:lang w:val="fr-CA"/>
-        </w:rPr>
-        <w:t xml:space="preserve">, </w:t>
-      </w:r>
-      <w:proofErr w:type="spellStart"/>
-      <w:r>
-        <w:rPr>
-          <w:lang w:val="fr-CA"/>
-        </w:rPr>
-        <w:t>client_id</w:t>
-      </w:r>
-      <w:proofErr w:type="spellEnd"/>
-      <w:r>
-        <w:rPr>
-          <w:lang w:val="fr-CA"/>
-        </w:rPr>
-        <w:t xml:space="preserve">, </w:t>
-      </w:r>
-      <w:proofErr w:type="spellStart"/>
-      <w:r>
-        <w:rPr>
-          <w:lang w:val="fr-CA"/>
-        </w:rPr>
-        <w:t>numero</w:t>
-      </w:r>
-      <w:proofErr w:type="spellEnd"/>
-      <w:r>
-        <w:rPr>
-          <w:lang w:val="fr-CA"/>
-        </w:rPr>
-        <w:t xml:space="preserve">, statut, </w:t>
-      </w:r>
-      <w:proofErr w:type="spellStart"/>
-      <w:r>
-        <w:rPr>
-          <w:lang w:val="fr-CA"/>
-        </w:rPr>
-        <w:t>type_vetement</w:t>
-      </w:r>
-      <w:proofErr w:type="spellEnd"/>
-      <w:r>
-        <w:rPr>
-          <w:lang w:val="fr-CA"/>
-        </w:rPr>
-        <w:t xml:space="preserve">, </w:t>
-      </w:r>
-      <w:proofErr w:type="spellStart"/>
-      <w:r>
-        <w:rPr>
-          <w:lang w:val="fr-CA"/>
-        </w:rPr>
-        <w:t>sous_total</w:t>
-      </w:r>
-      <w:proofErr w:type="spellEnd"/>
-      <w:r>
-        <w:rPr>
-          <w:lang w:val="fr-CA"/>
-        </w:rPr>
-        <w:t xml:space="preserve">, tva, acompte, solde, total, </w:t>
-      </w:r>
-      <w:proofErr w:type="spellStart"/>
-      <w:r>
-        <w:rPr>
-          <w:lang w:val="fr-CA"/>
-        </w:rPr>
-        <w:t>date_livraison</w:t>
-      </w:r>
-      <w:proofErr w:type="spellEnd"/>
-      <w:r>
-        <w:rPr>
-          <w:lang w:val="fr-CA"/>
-        </w:rPr>
-        <w:t xml:space="preserve"> — appartient à un utilisateur et à un client, possède plusieurs lignes ;</w:t>
+      <w:r>
+        <w:rPr>
+          <w:lang w:val="fr-CA"/>
+        </w:rPr>
+        <w:t>invoices : id, user_id, client_id, numero, statut, type_vetement, sous_total, tva, acompte, solde, total, date_livraison — appartient à un utilisateur et à un client, possède plusieurs lignes ;</w:t>
       </w:r>
     </w:p>
     <w:p>
@@ -6489,69 +5386,11 @@
           <w:lang w:val="fr-CA"/>
         </w:rPr>
       </w:pPr>
-      <w:proofErr w:type="spellStart"/>
-      <w:proofErr w:type="gramStart"/>
-      <w:r>
-        <w:rPr>
-          <w:lang w:val="fr-CA"/>
-        </w:rPr>
-        <w:t>invoice</w:t>
-      </w:r>
-      <w:proofErr w:type="gramEnd"/>
-      <w:r>
-        <w:rPr>
-          <w:lang w:val="fr-CA"/>
-        </w:rPr>
-        <w:t>_items</w:t>
-      </w:r>
-      <w:proofErr w:type="spellEnd"/>
-      <w:r>
-        <w:rPr>
-          <w:lang w:val="fr-CA"/>
-        </w:rPr>
-        <w:t xml:space="preserve"> : id, </w:t>
-      </w:r>
-      <w:proofErr w:type="spellStart"/>
-      <w:r>
-        <w:rPr>
-          <w:lang w:val="fr-CA"/>
-        </w:rPr>
-        <w:t>invoice_id</w:t>
-      </w:r>
-      <w:proofErr w:type="spellEnd"/>
-      <w:r>
-        <w:rPr>
-          <w:lang w:val="fr-CA"/>
-        </w:rPr>
-        <w:t xml:space="preserve">, description (tissu / façon / accessoire), </w:t>
-      </w:r>
-      <w:proofErr w:type="spellStart"/>
-      <w:r>
-        <w:rPr>
-          <w:lang w:val="fr-CA"/>
-        </w:rPr>
-        <w:t>quantite</w:t>
-      </w:r>
-      <w:proofErr w:type="spellEnd"/>
-      <w:r>
-        <w:rPr>
-          <w:lang w:val="fr-CA"/>
-        </w:rPr>
-        <w:t xml:space="preserve">, </w:t>
-      </w:r>
-      <w:proofErr w:type="spellStart"/>
-      <w:r>
-        <w:rPr>
-          <w:lang w:val="fr-CA"/>
-        </w:rPr>
-        <w:t>prix_unitaire</w:t>
-      </w:r>
-      <w:proofErr w:type="spellEnd"/>
-      <w:r>
-        <w:rPr>
-          <w:lang w:val="fr-CA"/>
-        </w:rPr>
-        <w:t xml:space="preserve"> — appartient à une facture.</w:t>
+      <w:r>
+        <w:rPr>
+          <w:lang w:val="fr-CA"/>
+        </w:rPr>
+        <w:t>invoice_items : id, invoice_id, description (tissu / façon / accessoire), quantite, prix_unitaire — appartient à une facture.</w:t>
       </w:r>
     </w:p>
     <w:p>
@@ -6565,30 +5404,8 @@
         <w:rPr>
           <w:lang w:val="fr-CA"/>
         </w:rPr>
-        <w:t xml:space="preserve">4.3 Intégration de l'intelligence artificielle </w:t>
-      </w:r>
-      <w:proofErr w:type="spellStart"/>
-      <w:r>
-        <w:rPr>
-          <w:lang w:val="fr-CA"/>
-        </w:rPr>
-        <w:t>ChatGPT</w:t>
-      </w:r>
-      <w:proofErr w:type="spellEnd"/>
-      <w:r>
-        <w:rPr>
-          <w:lang w:val="fr-CA"/>
-        </w:rPr>
-        <w:t xml:space="preserve"> dans </w:t>
-      </w:r>
-      <w:proofErr w:type="spellStart"/>
-      <w:r>
-        <w:rPr>
-          <w:lang w:val="fr-CA"/>
-        </w:rPr>
-        <w:t>Laravel</w:t>
-      </w:r>
-      <w:proofErr w:type="spellEnd"/>
+        <w:t>4.3 Intégration de l'intelligence artificielle ChatGPT dans Laravel</w:t>
+      </w:r>
     </w:p>
     <w:p>
       <w:pPr>
@@ -6601,91 +5418,7 @@
         <w:rPr>
           <w:lang w:val="fr-CA"/>
         </w:rPr>
-        <w:t xml:space="preserve">L'intégration de l'API </w:t>
-      </w:r>
-      <w:proofErr w:type="spellStart"/>
-      <w:r>
-        <w:rPr>
-          <w:lang w:val="fr-CA"/>
-        </w:rPr>
-        <w:t>ChatGPT</w:t>
-      </w:r>
-      <w:proofErr w:type="spellEnd"/>
-      <w:r>
-        <w:rPr>
-          <w:lang w:val="fr-CA"/>
-        </w:rPr>
-        <w:t xml:space="preserve"> (</w:t>
-      </w:r>
-      <w:proofErr w:type="spellStart"/>
-      <w:r>
-        <w:rPr>
-          <w:lang w:val="fr-CA"/>
-        </w:rPr>
-        <w:t>OpenAI</w:t>
-      </w:r>
-      <w:proofErr w:type="spellEnd"/>
-      <w:r>
-        <w:rPr>
-          <w:lang w:val="fr-CA"/>
-        </w:rPr>
-        <w:t xml:space="preserve">) au sein de l'API </w:t>
-      </w:r>
-      <w:proofErr w:type="spellStart"/>
-      <w:r>
-        <w:rPr>
-          <w:lang w:val="fr-CA"/>
-        </w:rPr>
-        <w:t>Laravel</w:t>
-      </w:r>
-      <w:proofErr w:type="spellEnd"/>
-      <w:r>
-        <w:rPr>
-          <w:lang w:val="fr-CA"/>
-        </w:rPr>
-        <w:t xml:space="preserve"> repose sur un service dédié, </w:t>
-      </w:r>
-      <w:proofErr w:type="spellStart"/>
-      <w:r>
-        <w:rPr>
-          <w:lang w:val="fr-CA"/>
-        </w:rPr>
-        <w:t>AIParsingService</w:t>
-      </w:r>
-      <w:proofErr w:type="spellEnd"/>
-      <w:r>
-        <w:rPr>
-          <w:lang w:val="fr-CA"/>
-        </w:rPr>
-        <w:t xml:space="preserve">, chargé d'envoyer le texte saisi ou dicté par l'utilisateur à l'API et de transformer la réponse structurée en un tableau exploitable par le contrôleur </w:t>
-      </w:r>
-      <w:proofErr w:type="spellStart"/>
-      <w:r>
-        <w:rPr>
-          <w:lang w:val="fr-CA"/>
-        </w:rPr>
-        <w:t>InvoiceController</w:t>
-      </w:r>
-      <w:proofErr w:type="spellEnd"/>
-      <w:r>
-        <w:rPr>
-          <w:lang w:val="fr-CA"/>
-        </w:rPr>
-        <w:t xml:space="preserve">, avant qu'il ne soit renvoyé à l'application Flutter. Cette approche respecte les principes d'architecture en couches de </w:t>
-      </w:r>
-      <w:proofErr w:type="spellStart"/>
-      <w:r>
-        <w:rPr>
-          <w:lang w:val="fr-CA"/>
-        </w:rPr>
-        <w:t>Laravel</w:t>
-      </w:r>
-      <w:proofErr w:type="spellEnd"/>
-      <w:r>
-        <w:rPr>
-          <w:lang w:val="fr-CA"/>
-        </w:rPr>
-        <w:t>, en isolant la logique d'appel à l'IA du reste de la logique métier.</w:t>
+        <w:t>L'intégration de l'API ChatGPT (OpenAI) au sein de l'API Laravel repose sur un service dédié, AIParsingService, chargé d'envoyer le texte saisi ou dicté par l'utilisateur à l'API et de transformer la réponse structurée en un tableau exploitable par le contrôleur InvoiceController, avant qu'il ne soit renvoyé à l'application Flutter. Cette approche respecte les principes d'architecture en couches de Laravel, en isolant la logique d'appel à l'IA du reste de la logique métier.</w:t>
       </w:r>
     </w:p>
     <w:p>
@@ -6711,35 +5444,7 @@
         <w:rPr>
           <w:lang w:val="fr-CA"/>
         </w:rPr>
-        <w:t xml:space="preserve">Backend — </w:t>
-      </w:r>
-      <w:proofErr w:type="spellStart"/>
-      <w:r>
-        <w:rPr>
-          <w:lang w:val="fr-CA"/>
-        </w:rPr>
-        <w:t>Laravel</w:t>
-      </w:r>
-      <w:proofErr w:type="spellEnd"/>
-      <w:r>
-        <w:rPr>
-          <w:lang w:val="fr-CA"/>
-        </w:rPr>
-        <w:t xml:space="preserve"> 11 : API REST, routage, contrôleurs, ORM </w:t>
-      </w:r>
-      <w:proofErr w:type="spellStart"/>
-      <w:r>
-        <w:rPr>
-          <w:lang w:val="fr-CA"/>
-        </w:rPr>
-        <w:t>Eloquent</w:t>
-      </w:r>
-      <w:proofErr w:type="spellEnd"/>
-      <w:r>
-        <w:rPr>
-          <w:lang w:val="fr-CA"/>
-        </w:rPr>
-        <w:t xml:space="preserve"> ;</w:t>
+        <w:t>Backend — Laravel 11 : API REST, routage, contrôleurs, ORM Eloquent ;</w:t>
       </w:r>
     </w:p>
     <w:p>
@@ -6757,21 +5462,7 @@
         <w:rPr>
           <w:lang w:val="fr-CA"/>
         </w:rPr>
-        <w:t xml:space="preserve">Frontend mobile — Flutter : application multiplateforme (Android/iOS) consommant l'API </w:t>
-      </w:r>
-      <w:proofErr w:type="spellStart"/>
-      <w:r>
-        <w:rPr>
-          <w:lang w:val="fr-CA"/>
-        </w:rPr>
-        <w:t>Laravel</w:t>
-      </w:r>
-      <w:proofErr w:type="spellEnd"/>
-      <w:r>
-        <w:rPr>
-          <w:lang w:val="fr-CA"/>
-        </w:rPr>
-        <w:t xml:space="preserve"> ;</w:t>
+        <w:t>Frontend mobile — Flutter : application multiplateforme (Android/iOS) consommant l'API Laravel ;</w:t>
       </w:r>
     </w:p>
     <w:p>
@@ -6789,35 +5480,7 @@
         <w:rPr>
           <w:lang w:val="fr-CA"/>
         </w:rPr>
-        <w:t xml:space="preserve">Intelligence artificielle — API </w:t>
-      </w:r>
-      <w:proofErr w:type="spellStart"/>
-      <w:r>
-        <w:rPr>
-          <w:lang w:val="fr-CA"/>
-        </w:rPr>
-        <w:t>ChatGPT</w:t>
-      </w:r>
-      <w:proofErr w:type="spellEnd"/>
-      <w:r>
-        <w:rPr>
-          <w:lang w:val="fr-CA"/>
-        </w:rPr>
-        <w:t xml:space="preserve"> (</w:t>
-      </w:r>
-      <w:proofErr w:type="spellStart"/>
-      <w:r>
-        <w:rPr>
-          <w:lang w:val="fr-CA"/>
-        </w:rPr>
-        <w:t>OpenAI</w:t>
-      </w:r>
-      <w:proofErr w:type="spellEnd"/>
-      <w:r>
-        <w:rPr>
-          <w:lang w:val="fr-CA"/>
-        </w:rPr>
-        <w:t>) : analyse du texte en langage naturel et structuration en JSON ;</w:t>
+        <w:t>Intelligence artificielle — API ChatGPT (OpenAI) : analyse du texte en langage naturel et structuration en JSON ;</w:t>
       </w:r>
     </w:p>
     <w:p>
@@ -6853,35 +5516,7 @@
         <w:rPr>
           <w:lang w:val="fr-CA"/>
         </w:rPr>
-        <w:t xml:space="preserve">Génération PDF — </w:t>
-      </w:r>
-      <w:proofErr w:type="spellStart"/>
-      <w:r>
-        <w:rPr>
-          <w:lang w:val="fr-CA"/>
-        </w:rPr>
-        <w:t>barryvdh</w:t>
-      </w:r>
-      <w:proofErr w:type="spellEnd"/>
-      <w:r>
-        <w:rPr>
-          <w:lang w:val="fr-CA"/>
-        </w:rPr>
-        <w:t>/</w:t>
-      </w:r>
-      <w:proofErr w:type="spellStart"/>
-      <w:r>
-        <w:rPr>
-          <w:lang w:val="fr-CA"/>
-        </w:rPr>
-        <w:t>laravel-dompdf</w:t>
-      </w:r>
-      <w:proofErr w:type="spellEnd"/>
-      <w:r>
-        <w:rPr>
-          <w:lang w:val="fr-CA"/>
-        </w:rPr>
-        <w:t xml:space="preserve"> : conversion HTML vers PDF professionnel ;</w:t>
+        <w:t>Génération PDF — barryvdh/laravel-dompdf : conversion HTML vers PDF professionnel ;</w:t>
       </w:r>
     </w:p>
     <w:p>
@@ -6899,21 +5534,7 @@
         <w:rPr>
           <w:lang w:val="fr-CA"/>
         </w:rPr>
-        <w:t xml:space="preserve">Emails asynchrones — </w:t>
-      </w:r>
-      <w:proofErr w:type="spellStart"/>
-      <w:r>
-        <w:rPr>
-          <w:lang w:val="fr-CA"/>
-        </w:rPr>
-        <w:t>Laravel</w:t>
-      </w:r>
-      <w:proofErr w:type="spellEnd"/>
-      <w:r>
-        <w:rPr>
-          <w:lang w:val="fr-CA"/>
-        </w:rPr>
-        <w:t xml:space="preserve"> Queues + SMTP : envoi du PDF par email en tâche de fond ;</w:t>
+        <w:t>Emails asynchrones — Laravel Queues + SMTP : envoi du PDF par email en tâche de fond ;</w:t>
       </w:r>
     </w:p>
     <w:p>
@@ -6931,49 +5552,7 @@
         <w:rPr>
           <w:lang w:val="fr-CA"/>
         </w:rPr>
-        <w:t xml:space="preserve">Authentification API — </w:t>
-      </w:r>
-      <w:proofErr w:type="spellStart"/>
-      <w:r>
-        <w:rPr>
-          <w:lang w:val="fr-CA"/>
-        </w:rPr>
-        <w:t>Laravel</w:t>
-      </w:r>
-      <w:proofErr w:type="spellEnd"/>
-      <w:r>
-        <w:rPr>
-          <w:lang w:val="fr-CA"/>
-        </w:rPr>
-        <w:t xml:space="preserve"> </w:t>
-      </w:r>
-      <w:proofErr w:type="spellStart"/>
-      <w:r>
-        <w:rPr>
-          <w:lang w:val="fr-CA"/>
-        </w:rPr>
-        <w:t>Sanctum</w:t>
-      </w:r>
-      <w:proofErr w:type="spellEnd"/>
-      <w:r>
-        <w:rPr>
-          <w:lang w:val="fr-CA"/>
-        </w:rPr>
-        <w:t xml:space="preserve"> : gestion des </w:t>
-      </w:r>
-      <w:proofErr w:type="spellStart"/>
-      <w:r>
-        <w:rPr>
-          <w:lang w:val="fr-CA"/>
-        </w:rPr>
-        <w:t>tokens</w:t>
-      </w:r>
-      <w:proofErr w:type="spellEnd"/>
-      <w:r>
-        <w:rPr>
-          <w:lang w:val="fr-CA"/>
-        </w:rPr>
-        <w:t xml:space="preserve"> pour l'application Flutter ;</w:t>
+        <w:t>Authentification API — Laravel Sanctum : gestion des tokens pour l'application Flutter ;</w:t>
       </w:r>
     </w:p>
     <w:p>
@@ -6991,21 +5570,7 @@
         <w:rPr>
           <w:lang w:val="fr-CA"/>
         </w:rPr>
-        <w:t xml:space="preserve">Déploiement — Railway / Render : hébergement de l'API </w:t>
-      </w:r>
-      <w:proofErr w:type="spellStart"/>
-      <w:r>
-        <w:rPr>
-          <w:lang w:val="fr-CA"/>
-        </w:rPr>
-        <w:t>Laravel</w:t>
-      </w:r>
-      <w:proofErr w:type="spellEnd"/>
-      <w:r>
-        <w:rPr>
-          <w:lang w:val="fr-CA"/>
-        </w:rPr>
-        <w:t>.</w:t>
+        <w:t>Déploiement — Railway / Render : hébergement de l'API Laravel.</w:t>
       </w:r>
     </w:p>
     <w:p>
@@ -7019,21 +5584,7 @@
         <w:rPr>
           <w:lang w:val="fr-CA"/>
         </w:rPr>
-        <w:t xml:space="preserve">À ces technologies s'ajoutent des outils de travail collaboratif et de conception : Visual Studio Code et Android Studio comme environnements de développement, GitHub pour la gestion de versions et le travail en équipe, Postman pour les tests d'API, ainsi que </w:t>
-      </w:r>
-      <w:proofErr w:type="spellStart"/>
-      <w:r>
-        <w:rPr>
-          <w:lang w:val="fr-CA"/>
-        </w:rPr>
-        <w:t>Figma</w:t>
-      </w:r>
-      <w:proofErr w:type="spellEnd"/>
-      <w:r>
-        <w:rPr>
-          <w:lang w:val="fr-CA"/>
-        </w:rPr>
-        <w:t xml:space="preserve"> pour la réalisation des maquettes de l'application Flutter.</w:t>
+        <w:t>À ces technologies s'ajoutent des outils de travail collaboratif et de conception : Visual Studio Code et Android Studio comme environnements de développement, GitHub pour la gestion de versions et le travail en équipe, Postman pour les tests d'API, ainsi que Figma pour la réalisation des maquettes de l'application Flutter.</w:t>
       </w:r>
     </w:p>
     <w:p>
@@ -7072,47 +5623,11 @@
           <w:lang w:val="fr-CA"/>
         </w:rPr>
       </w:pPr>
-      <w:proofErr w:type="spellStart"/>
-      <w:r>
-        <w:rPr>
-          <w:lang w:val="fr-CA"/>
-        </w:rPr>
-        <w:t>InvoiceAI</w:t>
-      </w:r>
-      <w:proofErr w:type="spellEnd"/>
-      <w:r>
-        <w:rPr>
-          <w:lang w:val="fr-CA"/>
-        </w:rPr>
-        <w:t xml:space="preserve"> adopte une architecture client-serveur découplée : l'application Flutter (client) envoie des requêtes HTTP/REST à l'API </w:t>
-      </w:r>
-      <w:proofErr w:type="spellStart"/>
-      <w:r>
-        <w:rPr>
-          <w:lang w:val="fr-CA"/>
-        </w:rPr>
-        <w:t>Laravel</w:t>
-      </w:r>
-      <w:proofErr w:type="spellEnd"/>
-      <w:r>
-        <w:rPr>
-          <w:lang w:val="fr-CA"/>
-        </w:rPr>
-        <w:t xml:space="preserve">, qui traite la logique métier, interroge la base de données MySQL et retourne les données au format JSON, ou fait appel à l'API </w:t>
-      </w:r>
-      <w:proofErr w:type="spellStart"/>
-      <w:r>
-        <w:rPr>
-          <w:lang w:val="fr-CA"/>
-        </w:rPr>
-        <w:t>ChatGPT</w:t>
-      </w:r>
-      <w:proofErr w:type="spellEnd"/>
-      <w:r>
-        <w:rPr>
-          <w:lang w:val="fr-CA"/>
-        </w:rPr>
-        <w:t xml:space="preserve"> pour l'analyse du langage naturel.</w:t>
+      <w:r>
+        <w:rPr>
+          <w:lang w:val="fr-CA"/>
+        </w:rPr>
+        <w:t>InvoiceAI adopte une architecture client-serveur découplée : l'application Flutter (client) envoie des requêtes HTTP/REST à l'API Laravel, qui traite la logique métier, interroge la base de données MySQL et retourne les données au format JSON, ou fait appel à l'API ChatGPT pour l'analyse du langage naturel.</w:t>
       </w:r>
     </w:p>
     <w:p>
@@ -7126,16 +5641,8 @@
         <w:rPr>
           <w:lang w:val="fr-CA"/>
         </w:rPr>
-        <w:t xml:space="preserve">6.2 Organisation de l'API </w:t>
-      </w:r>
-      <w:proofErr w:type="spellStart"/>
-      <w:r>
-        <w:rPr>
-          <w:lang w:val="fr-CA"/>
-        </w:rPr>
-        <w:t>Laravel</w:t>
-      </w:r>
-      <w:proofErr w:type="spellEnd"/>
+        <w:t>6.2 Organisation de l'API Laravel</w:t>
+      </w:r>
     </w:p>
     <w:p>
       <w:pPr>
@@ -7148,175 +5655,7 @@
         <w:rPr>
           <w:lang w:val="fr-CA"/>
         </w:rPr>
-        <w:t xml:space="preserve">Le backend </w:t>
-      </w:r>
-      <w:proofErr w:type="spellStart"/>
-      <w:r>
-        <w:rPr>
-          <w:lang w:val="fr-CA"/>
-        </w:rPr>
-        <w:t>Laravel</w:t>
-      </w:r>
-      <w:proofErr w:type="spellEnd"/>
-      <w:r>
-        <w:rPr>
-          <w:lang w:val="fr-CA"/>
-        </w:rPr>
-        <w:t xml:space="preserve"> structure l'API selon le patron Modèle-Vue-Contrôleur adapté à une API REST (sans vues Blade) : les Modèles (User, Client, </w:t>
-      </w:r>
-      <w:proofErr w:type="spellStart"/>
-      <w:r>
-        <w:rPr>
-          <w:lang w:val="fr-CA"/>
-        </w:rPr>
-        <w:t>Invoice</w:t>
-      </w:r>
-      <w:proofErr w:type="spellEnd"/>
-      <w:r>
-        <w:rPr>
-          <w:lang w:val="fr-CA"/>
-        </w:rPr>
-        <w:t xml:space="preserve">, </w:t>
-      </w:r>
-      <w:proofErr w:type="spellStart"/>
-      <w:r>
-        <w:rPr>
-          <w:lang w:val="fr-CA"/>
-        </w:rPr>
-        <w:t>InvoiceItem</w:t>
-      </w:r>
-      <w:proofErr w:type="spellEnd"/>
-      <w:r>
-        <w:rPr>
-          <w:lang w:val="fr-CA"/>
-        </w:rPr>
-        <w:t xml:space="preserve">) gèrent l'accès aux données via l'ORM </w:t>
-      </w:r>
-      <w:proofErr w:type="spellStart"/>
-      <w:r>
-        <w:rPr>
-          <w:lang w:val="fr-CA"/>
-        </w:rPr>
-        <w:t>Eloquent</w:t>
-      </w:r>
-      <w:proofErr w:type="spellEnd"/>
-      <w:r>
-        <w:rPr>
-          <w:lang w:val="fr-CA"/>
-        </w:rPr>
-        <w:t xml:space="preserve"> ; les Contrôleurs (</w:t>
-      </w:r>
-      <w:proofErr w:type="spellStart"/>
-      <w:r>
-        <w:rPr>
-          <w:lang w:val="fr-CA"/>
-        </w:rPr>
-        <w:t>InvoiceController</w:t>
-      </w:r>
-      <w:proofErr w:type="spellEnd"/>
-      <w:r>
-        <w:rPr>
-          <w:lang w:val="fr-CA"/>
-        </w:rPr>
-        <w:t xml:space="preserve">, </w:t>
-      </w:r>
-      <w:proofErr w:type="spellStart"/>
-      <w:r>
-        <w:rPr>
-          <w:lang w:val="fr-CA"/>
-        </w:rPr>
-        <w:t>ClientController</w:t>
-      </w:r>
-      <w:proofErr w:type="spellEnd"/>
-      <w:r>
-        <w:rPr>
-          <w:lang w:val="fr-CA"/>
-        </w:rPr>
-        <w:t xml:space="preserve">, </w:t>
-      </w:r>
-      <w:proofErr w:type="spellStart"/>
-      <w:r>
-        <w:rPr>
-          <w:lang w:val="fr-CA"/>
-        </w:rPr>
-        <w:t>DashboardController</w:t>
-      </w:r>
-      <w:proofErr w:type="spellEnd"/>
-      <w:r>
-        <w:rPr>
-          <w:lang w:val="fr-CA"/>
-        </w:rPr>
-        <w:t>) exposent des points d'accès (</w:t>
-      </w:r>
-      <w:proofErr w:type="spellStart"/>
-      <w:r>
-        <w:rPr>
-          <w:lang w:val="fr-CA"/>
-        </w:rPr>
-        <w:t>endpoints</w:t>
-      </w:r>
-      <w:proofErr w:type="spellEnd"/>
-      <w:r>
-        <w:rPr>
-          <w:lang w:val="fr-CA"/>
-        </w:rPr>
-        <w:t>) consommés par l'application Flutter, en s'appuyant sur des Services dédiés (</w:t>
-      </w:r>
-      <w:proofErr w:type="spellStart"/>
-      <w:r>
-        <w:rPr>
-          <w:lang w:val="fr-CA"/>
-        </w:rPr>
-        <w:t>AIParsingService</w:t>
-      </w:r>
-      <w:proofErr w:type="spellEnd"/>
-      <w:r>
-        <w:rPr>
-          <w:lang w:val="fr-CA"/>
-        </w:rPr>
-        <w:t xml:space="preserve">, </w:t>
-      </w:r>
-      <w:proofErr w:type="spellStart"/>
-      <w:r>
-        <w:rPr>
-          <w:lang w:val="fr-CA"/>
-        </w:rPr>
-        <w:t>InvoiceService</w:t>
-      </w:r>
-      <w:proofErr w:type="spellEnd"/>
-      <w:r>
-        <w:rPr>
-          <w:lang w:val="fr-CA"/>
-        </w:rPr>
-        <w:t xml:space="preserve">, </w:t>
-      </w:r>
-      <w:proofErr w:type="spellStart"/>
-      <w:r>
-        <w:rPr>
-          <w:lang w:val="fr-CA"/>
-        </w:rPr>
-        <w:t>PDFService</w:t>
-      </w:r>
-      <w:proofErr w:type="spellEnd"/>
-      <w:r>
-        <w:rPr>
-          <w:lang w:val="fr-CA"/>
-        </w:rPr>
-        <w:t>) et des Jobs asynchrones (</w:t>
-      </w:r>
-      <w:proofErr w:type="spellStart"/>
-      <w:r>
-        <w:rPr>
-          <w:lang w:val="fr-CA"/>
-        </w:rPr>
-        <w:t>SendInvoiceEmailJob</w:t>
-      </w:r>
-      <w:proofErr w:type="spellEnd"/>
-      <w:r>
-        <w:rPr>
-          <w:lang w:val="fr-CA"/>
-        </w:rPr>
-        <w:t>).</w:t>
+        <w:t>Le backend Laravel structure l'API selon le patron Modèle-Vue-Contrôleur adapté à une API REST (sans vues Blade) : les Modèles (User, Client, Invoice, InvoiceItem) gèrent l'accès aux données via l'ORM Eloquent ; les Contrôleurs (InvoiceController, ClientController, DashboardController) exposent des points d'accès (endpoints) consommés par l'application Flutter, en s'appuyant sur des Services dédiés (AIParsingService, InvoiceService, PDFService) et des Jobs asynchrones (SendInvoiceEmailJob).</w:t>
       </w:r>
     </w:p>
     <w:p>
@@ -7358,21 +5697,7 @@
         <w:rPr>
           <w:lang w:val="fr-CA"/>
         </w:rPr>
-        <w:t>Cette partie présente la mise en œuvre concrète d'</w:t>
-      </w:r>
-      <w:proofErr w:type="spellStart"/>
-      <w:r>
-        <w:rPr>
-          <w:lang w:val="fr-CA"/>
-        </w:rPr>
-        <w:t>InvoiceAI</w:t>
-      </w:r>
-      <w:proofErr w:type="spellEnd"/>
-      <w:r>
-        <w:rPr>
-          <w:lang w:val="fr-CA"/>
-        </w:rPr>
-        <w:t>. Elle décrit les principaux écrans de l'application Flutter développée et illustre, à travers des captures d'écran, le fonctionnement réel de l'application.</w:t>
+        <w:t>Cette partie présente la mise en œuvre concrète d'InvoiceAI. Elle décrit les principaux écrans de l'application Flutter développée et illustre, à travers des captures d'écran, le fonctionnement réel de l'application.</w:t>
       </w:r>
     </w:p>
     <w:p>
@@ -7400,21 +5725,7 @@
         <w:rPr>
           <w:lang w:val="fr-CA"/>
         </w:rPr>
-        <w:t xml:space="preserve">L'écran d'accueil présente </w:t>
-      </w:r>
-      <w:proofErr w:type="spellStart"/>
-      <w:r>
-        <w:rPr>
-          <w:lang w:val="fr-CA"/>
-        </w:rPr>
-        <w:t>InvoiceAI</w:t>
-      </w:r>
-      <w:proofErr w:type="spellEnd"/>
-      <w:r>
-        <w:rPr>
-          <w:lang w:val="fr-CA"/>
-        </w:rPr>
-        <w:t>, son fonctionnement et ses avantages pour les ateliers de couture, avec un accès direct à la connexion et à l'inscription.</w:t>
+        <w:t>L'écran d'accueil présente InvoiceAI, son fonctionnement et ses avantages pour les ateliers de couture, avec un accès direct à la connexion et à l'inscription.</w:t>
       </w:r>
     </w:p>
     <w:p>
@@ -7498,35 +5809,7 @@
         <w:rPr>
           <w:lang w:val="fr-CA"/>
         </w:rPr>
-        <w:t>Cet écran constitue le cœur de l'innovation d'</w:t>
-      </w:r>
-      <w:proofErr w:type="spellStart"/>
-      <w:r>
-        <w:rPr>
-          <w:lang w:val="fr-CA"/>
-        </w:rPr>
-        <w:t>InvoiceAI</w:t>
-      </w:r>
-      <w:proofErr w:type="spellEnd"/>
-      <w:r>
-        <w:rPr>
-          <w:lang w:val="fr-CA"/>
-        </w:rPr>
-        <w:t xml:space="preserve"> : le tailleur y décrit sa commande au clavier ou à la voix, puis l'application affiche un formulaire </w:t>
-      </w:r>
-      <w:proofErr w:type="spellStart"/>
-      <w:r>
-        <w:rPr>
-          <w:lang w:val="fr-CA"/>
-        </w:rPr>
-        <w:t>pré-rempli</w:t>
-      </w:r>
-      <w:proofErr w:type="spellEnd"/>
-      <w:r>
-        <w:rPr>
-          <w:lang w:val="fr-CA"/>
-        </w:rPr>
-        <w:t xml:space="preserve"> par l'IA, modifiable avant validation.</w:t>
+        <w:t>Cet écran constitue le cœur de l'innovation d'InvoiceAI : le tailleur y décrit sa commande au clavier ou à la voix, puis l'application affiche un formulaire pré-rempli par l'IA, modifiable avant validation.</w:t>
       </w:r>
     </w:p>
     <w:p>
@@ -7636,21 +5919,7 @@
         <w:rPr>
           <w:lang w:val="fr-CA"/>
         </w:rPr>
-        <w:t xml:space="preserve">Structuration fiable des réponses de </w:t>
-      </w:r>
-      <w:proofErr w:type="spellStart"/>
-      <w:r>
-        <w:rPr>
-          <w:lang w:val="fr-CA"/>
-        </w:rPr>
-        <w:t>ChatGPT</w:t>
-      </w:r>
-      <w:proofErr w:type="spellEnd"/>
-      <w:r>
-        <w:rPr>
-          <w:lang w:val="fr-CA"/>
-        </w:rPr>
-        <w:t xml:space="preserve"> en JSON exploitable, nécessitant un prompt système précis adapté au vocabulaire de la couture (façon, tissu, doublure, broderie) ;</w:t>
+        <w:t>Structuration fiable des réponses de ChatGPT en JSON exploitable, nécessitant un prompt système précis adapté au vocabulaire de la couture (façon, tissu, doublure, broderie) ;</w:t>
       </w:r>
     </w:p>
     <w:p>
@@ -7686,35 +5955,7 @@
         <w:rPr>
           <w:lang w:val="fr-CA"/>
         </w:rPr>
-        <w:t xml:space="preserve">Communication fiable entre l'application Flutter et l'API </w:t>
-      </w:r>
-      <w:proofErr w:type="spellStart"/>
-      <w:r>
-        <w:rPr>
-          <w:lang w:val="fr-CA"/>
-        </w:rPr>
-        <w:t>Laravel</w:t>
-      </w:r>
-      <w:proofErr w:type="spellEnd"/>
-      <w:r>
-        <w:rPr>
-          <w:lang w:val="fr-CA"/>
-        </w:rPr>
-        <w:t xml:space="preserve"> (gestion des erreurs réseau, des </w:t>
-      </w:r>
-      <w:proofErr w:type="spellStart"/>
-      <w:r>
-        <w:rPr>
-          <w:lang w:val="fr-CA"/>
-        </w:rPr>
-        <w:t>tokens</w:t>
-      </w:r>
-      <w:proofErr w:type="spellEnd"/>
-      <w:r>
-        <w:rPr>
-          <w:lang w:val="fr-CA"/>
-        </w:rPr>
-        <w:t xml:space="preserve"> d'authentification) ;</w:t>
+        <w:t>Communication fiable entre l'application Flutter et l'API Laravel (gestion des erreurs réseau, des tokens d'authentification) ;</w:t>
       </w:r>
     </w:p>
     <w:p>
@@ -7764,35 +6005,7 @@
         <w:rPr>
           <w:lang w:val="fr-CA"/>
         </w:rPr>
-        <w:t xml:space="preserve">Ces difficultés ont été surmontées grâce à l'écriture de prompts systèmes stricts et spécialisés pour </w:t>
-      </w:r>
-      <w:proofErr w:type="spellStart"/>
-      <w:r>
-        <w:rPr>
-          <w:lang w:val="fr-CA"/>
-        </w:rPr>
-        <w:t>ChatGPT</w:t>
-      </w:r>
-      <w:proofErr w:type="spellEnd"/>
-      <w:r>
-        <w:rPr>
-          <w:lang w:val="fr-CA"/>
-        </w:rPr>
-        <w:t xml:space="preserve">, à la validation manuelle du formulaire avant enregistrement côté Flutter, ainsi qu'à l'utilisation des files d'attente (Queues) de </w:t>
-      </w:r>
-      <w:proofErr w:type="spellStart"/>
-      <w:r>
-        <w:rPr>
-          <w:lang w:val="fr-CA"/>
-        </w:rPr>
-        <w:t>Laravel</w:t>
-      </w:r>
-      <w:proofErr w:type="spellEnd"/>
-      <w:r>
-        <w:rPr>
-          <w:lang w:val="fr-CA"/>
-        </w:rPr>
-        <w:t xml:space="preserve"> pour les traitements asynchrones.</w:t>
+        <w:t>Ces difficultés ont été surmontées grâce à l'écriture de prompts systèmes stricts et spécialisés pour ChatGPT, à la validation manuelle du formulaire avant enregistrement côté Flutter, ainsi qu'à l'utilisation des files d'attente (Queues) de Laravel pour les traitements asynchrones.</w:t>
       </w:r>
     </w:p>
     <w:p>
@@ -7834,35 +6047,7 @@
         <w:rPr>
           <w:lang w:val="fr-CA"/>
         </w:rPr>
-        <w:t xml:space="preserve">Le projet </w:t>
-      </w:r>
-      <w:proofErr w:type="spellStart"/>
-      <w:r>
-        <w:rPr>
-          <w:lang w:val="fr-CA"/>
-        </w:rPr>
-        <w:t>InvoiceAI</w:t>
-      </w:r>
-      <w:proofErr w:type="spellEnd"/>
-      <w:r>
-        <w:rPr>
-          <w:lang w:val="fr-CA"/>
-        </w:rPr>
-        <w:t xml:space="preserve"> a permis de concevoir et de développer une application intelligente, combinant une API </w:t>
-      </w:r>
-      <w:proofErr w:type="spellStart"/>
-      <w:r>
-        <w:rPr>
-          <w:lang w:val="fr-CA"/>
-        </w:rPr>
-        <w:t>Laravel</w:t>
-      </w:r>
-      <w:proofErr w:type="spellEnd"/>
-      <w:r>
-        <w:rPr>
-          <w:lang w:val="fr-CA"/>
-        </w:rPr>
-        <w:t xml:space="preserve"> et une interface mobile Flutter, répondant à un besoin réel des ateliers de couture : celui de disposer d'un outil simple, rapide et professionnel pour gérer leurs devis et factures — mesures, tissu, façon, acompte et solde compris — sans compétence comptable préalable.</w:t>
+        <w:t>Le projet InvoiceAI a permis de concevoir et de développer une application intelligente, combinant une API Laravel et une interface mobile Flutter, répondant à un besoin réel des ateliers de couture : celui de disposer d'un outil simple, rapide et professionnel pour gérer leurs devis et factures — mesures, tissu, façon, acompte et solde compris — sans compétence comptable préalable.</w:t>
       </w:r>
     </w:p>
     <w:p>
@@ -7876,77 +6061,7 @@
         <w:rPr>
           <w:lang w:val="fr-CA"/>
         </w:rPr>
-        <w:t xml:space="preserve">Grâce à l'intégration de l'intelligence artificielle de </w:t>
-      </w:r>
-      <w:proofErr w:type="spellStart"/>
-      <w:r>
-        <w:rPr>
-          <w:lang w:val="fr-CA"/>
-        </w:rPr>
-        <w:t>ChatGPT</w:t>
-      </w:r>
-      <w:proofErr w:type="spellEnd"/>
-      <w:r>
-        <w:rPr>
-          <w:lang w:val="fr-CA"/>
-        </w:rPr>
-        <w:t xml:space="preserve"> (</w:t>
-      </w:r>
-      <w:proofErr w:type="spellStart"/>
-      <w:r>
-        <w:rPr>
-          <w:lang w:val="fr-CA"/>
-        </w:rPr>
-        <w:t>OpenAI</w:t>
-      </w:r>
-      <w:proofErr w:type="spellEnd"/>
-      <w:r>
-        <w:rPr>
-          <w:lang w:val="fr-CA"/>
-        </w:rPr>
-        <w:t xml:space="preserve">) au sein d'une architecture </w:t>
-      </w:r>
-      <w:proofErr w:type="spellStart"/>
-      <w:r>
-        <w:rPr>
-          <w:lang w:val="fr-CA"/>
-        </w:rPr>
-        <w:t>Laravel</w:t>
-      </w:r>
-      <w:proofErr w:type="spellEnd"/>
-      <w:r>
-        <w:rPr>
-          <w:lang w:val="fr-CA"/>
-        </w:rPr>
-        <w:t xml:space="preserve"> robuste, </w:t>
-      </w:r>
-      <w:proofErr w:type="spellStart"/>
-      <w:r>
-        <w:rPr>
-          <w:lang w:val="fr-CA"/>
-        </w:rPr>
-        <w:t>InvoiceAI</w:t>
-      </w:r>
-      <w:proofErr w:type="spellEnd"/>
-      <w:r>
-        <w:rPr>
-          <w:lang w:val="fr-CA"/>
-        </w:rPr>
-        <w:t xml:space="preserve"> démontre qu'il est possible de transformer une simple description en langage naturel, dictée ou tapée, d'une commande de couture en un document commercial structuré, calculé et prêt à l'envoi. Ce projet a également permis à l'équipe de renforcer ses compétences en développement mobile Flutter, en API REST </w:t>
-      </w:r>
-      <w:proofErr w:type="spellStart"/>
-      <w:r>
-        <w:rPr>
-          <w:lang w:val="fr-CA"/>
-        </w:rPr>
-        <w:t>Laravel</w:t>
-      </w:r>
-      <w:proofErr w:type="spellEnd"/>
-      <w:r>
-        <w:rPr>
-          <w:lang w:val="fr-CA"/>
-        </w:rPr>
-        <w:t>, en modélisation de bases de données, en intégration d'API d'intelligence artificielle, ainsi qu'en gestion de projet en équipe.</w:t>
+        <w:t>Grâce à l'intégration de l'intelligence artificielle de ChatGPT (OpenAI) au sein d'une architecture Laravel robuste, InvoiceAI démontre qu'il est possible de transformer une simple description en langage naturel, dictée ou tapée, d'une commande de couture en un document commercial structuré, calculé et prêt à l'envoi. Ce projet a également permis à l'équipe de renforcer ses compétences en développement mobile Flutter, en API REST Laravel, en modélisation de bases de données, en intégration d'API d'intelligence artificielle, ainsi qu'en gestion de projet en équipe.</w:t>
       </w:r>
     </w:p>
     <w:p>
@@ -7960,21 +6075,7 @@
         <w:rPr>
           <w:lang w:val="fr-CA"/>
         </w:rPr>
-        <w:t xml:space="preserve">Au-delà du MVP réalisé, plusieurs perspectives d'évolution ont été identifiées afin de transformer </w:t>
-      </w:r>
-      <w:proofErr w:type="spellStart"/>
-      <w:r>
-        <w:rPr>
-          <w:lang w:val="fr-CA"/>
-        </w:rPr>
-        <w:t>InvoiceAI</w:t>
-      </w:r>
-      <w:proofErr w:type="spellEnd"/>
-      <w:r>
-        <w:rPr>
-          <w:lang w:val="fr-CA"/>
-        </w:rPr>
-        <w:t xml:space="preserve"> en une véritable solution commerciale destinée aux ateliers de couture : l'intégration de moyens de paiement en ligne locaux et internationaux pour les acomptes, l'enrichissement de la saisie vocale, la conversion automatique des devis en factures à la livraison, l'envoi de rappels automatiques d'essayage et de paiement, un catalogue de modèles réutilisables, ainsi que la mise en place d'un modèle d'abonnement SaaS multilingue.</w:t>
+        <w:t>Au-delà du MVP réalisé, plusieurs perspectives d'évolution ont été identifiées afin de transformer InvoiceAI en une véritable solution commerciale destinée aux ateliers de couture : l'intégration de moyens de paiement en ligne locaux et internationaux pour les acomptes, l'enrichissement de la saisie vocale, la conversion automatique des devis en factures à la livraison, l'envoi de rappels automatiques d'essayage et de paiement, un catalogue de modèles réutilisables, ainsi que la mise en place d'un modèle d'abonnement SaaS multilingue.</w:t>
       </w:r>
     </w:p>
     <w:p>
@@ -8030,49 +6131,7 @@
         <w:rPr>
           <w:lang w:val="fr-CA"/>
         </w:rPr>
-        <w:t xml:space="preserve">Extraits de code significatifs (routes API, service </w:t>
-      </w:r>
-      <w:proofErr w:type="spellStart"/>
-      <w:r>
-        <w:rPr>
-          <w:lang w:val="fr-CA"/>
-        </w:rPr>
-        <w:t>AIParsingService</w:t>
-      </w:r>
-      <w:proofErr w:type="spellEnd"/>
-      <w:r>
-        <w:rPr>
-          <w:lang w:val="fr-CA"/>
-        </w:rPr>
-        <w:t xml:space="preserve">, écrans Flutter), </w:t>
-      </w:r>
-      <w:proofErr w:type="gramStart"/>
-      <w:r>
-        <w:rPr>
-          <w:lang w:val="fr-CA"/>
-        </w:rPr>
-        <w:t>fichier .</w:t>
-      </w:r>
-      <w:proofErr w:type="spellStart"/>
-      <w:r>
-        <w:rPr>
-          <w:lang w:val="fr-CA"/>
-        </w:rPr>
-        <w:t>env</w:t>
-      </w:r>
-      <w:proofErr w:type="gramEnd"/>
-      <w:r>
-        <w:rPr>
-          <w:lang w:val="fr-CA"/>
-        </w:rPr>
-        <w:t>.example</w:t>
-      </w:r>
-      <w:proofErr w:type="spellEnd"/>
-      <w:r>
-        <w:rPr>
-          <w:lang w:val="fr-CA"/>
-        </w:rPr>
-        <w:t>, et tout autre document complémentaire jugé utile pourront être ajoutés ici.</w:t>
+        <w:t>Extraits de code significatifs (routes API, service AIParsingService, écrans Flutter), fichier .env.example, et tout autre document complémentaire jugé utile pourront être ajoutés ici.</w:t>
       </w:r>
     </w:p>
     <w:p>
@@ -8112,21 +6171,7 @@
         <w:rPr>
           <w:lang w:val="fr-CA"/>
         </w:rPr>
-        <w:t xml:space="preserve">Documentation </w:t>
-      </w:r>
-      <w:proofErr w:type="spellStart"/>
-      <w:r>
-        <w:rPr>
-          <w:lang w:val="fr-CA"/>
-        </w:rPr>
-        <w:t>Laravel</w:t>
-      </w:r>
-      <w:proofErr w:type="spellEnd"/>
-      <w:r>
-        <w:rPr>
-          <w:lang w:val="fr-CA"/>
-        </w:rPr>
-        <w:t xml:space="preserve"> : https://laravel.com/docs</w:t>
+        <w:t>Documentation Laravel : https://laravel.com/docs</w:t>
       </w:r>
     </w:p>
     <w:p>
@@ -8156,15 +6201,7 @@
         </w:numPr>
       </w:pPr>
       <w:r>
-        <w:t>API ChatGPT (OpenAI</w:t>
-      </w:r>
-      <w:proofErr w:type="gramStart"/>
-      <w:r>
-        <w:t>) :</w:t>
-      </w:r>
-      <w:proofErr w:type="gramEnd"/>
-      <w:r>
-        <w:t xml:space="preserve"> https://platform.openai.com/docs</w:t>
+        <w:t>API ChatGPT (OpenAI) : https://platform.openai.com/docs</w:t>
       </w:r>
     </w:p>
     <w:p>
@@ -8178,33 +6215,11 @@
           <w:lang w:val="fr-CA"/>
         </w:rPr>
       </w:pPr>
-      <w:proofErr w:type="spellStart"/>
-      <w:r>
-        <w:rPr>
-          <w:lang w:val="fr-CA"/>
-        </w:rPr>
-        <w:t>DomPDF</w:t>
-      </w:r>
-      <w:proofErr w:type="spellEnd"/>
-      <w:r>
-        <w:rPr>
-          <w:lang w:val="fr-CA"/>
-        </w:rPr>
-        <w:t xml:space="preserve"> pour </w:t>
-      </w:r>
-      <w:proofErr w:type="spellStart"/>
-      <w:r>
-        <w:rPr>
-          <w:lang w:val="fr-CA"/>
-        </w:rPr>
-        <w:t>Laravel</w:t>
-      </w:r>
-      <w:proofErr w:type="spellEnd"/>
-      <w:r>
-        <w:rPr>
-          <w:lang w:val="fr-CA"/>
-        </w:rPr>
-        <w:t xml:space="preserve"> : https://github.com/barryvdh/laravel-dompdf</w:t>
+      <w:r>
+        <w:rPr>
+          <w:lang w:val="fr-CA"/>
+        </w:rPr>
+        <w:t>DomPDF pour Laravel : https://github.com/barryvdh/laravel-dompdf</w:t>
       </w:r>
     </w:p>
     <w:p>
@@ -8216,23 +6231,7 @@
         </w:numPr>
       </w:pPr>
       <w:r>
-        <w:t>Laravel Sanctum (</w:t>
-      </w:r>
-      <w:proofErr w:type="spellStart"/>
-      <w:r>
-        <w:t>authentification</w:t>
-      </w:r>
-      <w:proofErr w:type="spellEnd"/>
-      <w:r>
-        <w:t xml:space="preserve"> API</w:t>
-      </w:r>
-      <w:proofErr w:type="gramStart"/>
-      <w:r>
-        <w:t>) :</w:t>
-      </w:r>
-      <w:proofErr w:type="gramEnd"/>
-      <w:r>
-        <w:t xml:space="preserve"> https://laravel.com/docs/sanctum</w:t>
+        <w:t>Laravel Sanctum (authentification API) : https://laravel.com/docs/sanctum</w:t>
       </w:r>
     </w:p>
     <w:p>
@@ -8246,19 +6245,11 @@
           <w:lang w:val="fr-CA"/>
         </w:rPr>
       </w:pPr>
-      <w:proofErr w:type="spellStart"/>
-      <w:r>
-        <w:rPr>
-          <w:lang w:val="fr-CA"/>
-        </w:rPr>
-        <w:t>Laravel</w:t>
-      </w:r>
-      <w:proofErr w:type="spellEnd"/>
-      <w:r>
-        <w:rPr>
-          <w:lang w:val="fr-CA"/>
-        </w:rPr>
-        <w:t xml:space="preserve"> Queues : https://laravel.com/docs/queues</w:t>
+      <w:r>
+        <w:rPr>
+          <w:lang w:val="fr-CA"/>
+        </w:rPr>
+        <w:t>Laravel Queues : https://laravel.com/docs/queues</w:t>
       </w:r>
     </w:p>
     <w:p>
@@ -8270,20 +6261,7 @@
         </w:numPr>
       </w:pPr>
       <w:r>
-        <w:t>Railway (</w:t>
-      </w:r>
-      <w:proofErr w:type="spellStart"/>
-      <w:r>
-        <w:t>déploiement</w:t>
-      </w:r>
-      <w:proofErr w:type="spellEnd"/>
-      <w:proofErr w:type="gramStart"/>
-      <w:r>
-        <w:t>) :</w:t>
-      </w:r>
-      <w:proofErr w:type="gramEnd"/>
-      <w:r>
-        <w:t xml:space="preserve"> https://railway.app</w:t>
+        <w:t>Railway (déploiement) : https://railway.app</w:t>
       </w:r>
     </w:p>
     <w:sectPr>
@@ -8413,31 +6391,7 @@
         <w:szCs w:val="16"/>
         <w:lang w:val="fr-CA"/>
       </w:rPr>
-      <w:t xml:space="preserve">Thème : </w:t>
-    </w:r>
-    <w:proofErr w:type="spellStart"/>
-    <w:r>
-      <w:rPr>
-        <w:i/>
-        <w:iCs/>
-        <w:color w:val="555555"/>
-        <w:sz w:val="16"/>
-        <w:szCs w:val="16"/>
-        <w:lang w:val="fr-CA"/>
-      </w:rPr>
-      <w:t>InvoiceAI</w:t>
-    </w:r>
-    <w:proofErr w:type="spellEnd"/>
-    <w:r>
-      <w:rPr>
-        <w:i/>
-        <w:iCs/>
-        <w:color w:val="555555"/>
-        <w:sz w:val="16"/>
-        <w:szCs w:val="16"/>
-        <w:lang w:val="fr-CA"/>
-      </w:rPr>
-      <w:t xml:space="preserve"> – Génération intelligente de devis et factures</w:t>
+      <w:t>Thème : InvoiceAI – Génération intelligente de devis et factures</w:t>
     </w:r>
   </w:p>
 </w:hdr>

</xml_diff>